<commit_message>
DP officiel : ajout des diplômes (BTS SIO SLAM, Bac série C), nom et titre visé
</commit_message>
<xml_diff>
--- a/livrables/Dossier_Professionnel_CongesFlow_OFFICIEL.docx
+++ b/livrables/Dossier_Professionnel_CongesFlow_OFFICIEL.docx
@@ -177,13 +177,12 @@
                 </w:pPr>
                 <w:r>
                   <w:rPr>
-                    <w:rStyle w:val="Textedelespacerserv"/>
                     <w:i/>
                     <w:color w:val="595959" w:themeColor="text1" w:themeTint="A6"/>
                     <w:sz w:val="24"/>
                     <w:highlight w:val="lightGray"/>
                   </w:rPr>
-                  <w:t>BOUNGOU MBIMI</w:t>
+                  <w:t xml:space="preserve">BOUNGOU MBIMI</w:t>
                 </w:r>
               </w:p>
             </w:tc>
@@ -282,12 +281,11 @@
                 </w:pPr>
                 <w:r>
                   <w:rPr>
-                    <w:rStyle w:val="Textedelespacerserv"/>
                     <w:i/>
                     <w:color w:val="595959" w:themeColor="text1" w:themeTint="A6"/>
                     <w:highlight w:val="lightGray"/>
                   </w:rPr>
-                  <w:t>BOUNGOU MBIMI</w:t>
+                  <w:t xml:space="preserve">BOUNGOU MBIMI</w:t>
                 </w:r>
               </w:p>
             </w:tc>
@@ -386,13 +384,12 @@
                 </w:pPr>
                 <w:r>
                   <w:rPr>
-                    <w:rStyle w:val="Textedelespacerserv"/>
                     <w:i/>
                     <w:color w:val="595959" w:themeColor="text1" w:themeTint="A6"/>
                     <w:sz w:val="24"/>
                     <w:highlight w:val="lightGray"/>
                   </w:rPr>
-                  <w:t>Gloire Bryan</w:t>
+                  <w:t xml:space="preserve">Gloire Bryan</w:t>
                 </w:r>
               </w:p>
             </w:tc>
@@ -729,14 +726,13 @@
                 </w:pPr>
                 <w:r>
                   <w:rPr>
-                    <w:rStyle w:val="Textedelespacerserv"/>
                     <w:i/>
                     <w:color w:val="595959" w:themeColor="text1" w:themeTint="A6"/>
                     <w:sz w:val="28"/>
                     <w:szCs w:val="32"/>
                     <w:highlight w:val="lightGray"/>
                   </w:rPr>
-                  <w:t>Concepteur Développeur d'Applications</w:t>
+                  <w:t xml:space="preserve">Concepteur Développeur d'Applications</w:t>
                 </w:r>
               </w:p>
             </w:tc>
@@ -1227,12 +1223,6 @@
                 <w:color w:val="404040" w:themeColor="text1" w:themeTint="BF"/>
               </w:rPr>
               <w:t>Le dossier professionnel (DP) constitue un élément du système de validation du titre professionnel.</w:t>
-            </w:r>
-            <w:r>
-              <w:rPr>
-                <w:rFonts w:cstheme="minorHAnsi"/>
-                <w:color w:val="404040" w:themeColor="text1" w:themeTint="BF"/>
-              </w:rPr>
               <w:br/>
             </w:r>
             <w:r>
@@ -1382,16 +1372,7 @@
                 <w:sz w:val="20"/>
                 <w:szCs w:val="20"/>
               </w:rPr>
-              <w:t>Des</w:t>
-            </w:r>
-            <w:r>
-              <w:rPr>
-                <w:rFonts w:cstheme="minorHAnsi"/>
-                <w:color w:val="404040" w:themeColor="text1" w:themeTint="BF"/>
-                <w:sz w:val="20"/>
-                <w:szCs w:val="20"/>
-              </w:rPr>
-              <w:t xml:space="preserve"> résultats de la mise en situation professionnelle complétés, éventuellement, du questionnaire professionnel ou de l’entretien professionnel ou de l’entretien technique ou du questionnement à partir de productions.</w:t>
+              <w:t xml:space="preserve">Des résultats de la mise en situation professionnelle complétés, éventuellement, du questionnaire professionnel ou de l’entretien professionnel ou de l’entretien technique ou du questionnement à partir de productions.</w:t>
             </w:r>
           </w:p>
           <w:p>
@@ -1440,16 +1421,7 @@
                 <w:sz w:val="20"/>
                 <w:szCs w:val="20"/>
               </w:rPr>
-              <w:t>Du</w:t>
-            </w:r>
-            <w:r>
-              <w:rPr>
-                <w:rFonts w:cstheme="minorHAnsi"/>
-                <w:color w:val="404040" w:themeColor="text1" w:themeTint="BF"/>
-                <w:sz w:val="20"/>
-                <w:szCs w:val="20"/>
-              </w:rPr>
-              <w:t xml:space="preserve"> </w:t>
+              <w:t xml:space="preserve">Du </w:t>
             </w:r>
             <w:r>
               <w:rPr>
@@ -1517,16 +1489,7 @@
                 <w:sz w:val="20"/>
                 <w:szCs w:val="20"/>
               </w:rPr>
-              <w:t>Des</w:t>
-            </w:r>
-            <w:r>
-              <w:rPr>
-                <w:rFonts w:cstheme="minorHAnsi"/>
-                <w:color w:val="404040" w:themeColor="text1" w:themeTint="BF"/>
-                <w:sz w:val="20"/>
-                <w:szCs w:val="20"/>
-              </w:rPr>
-              <w:t xml:space="preserve"> résultats des évaluations passées en cours de formation lorsque le candidat évalué est issu d’un parcours de formation</w:t>
+              <w:t xml:space="preserve">Des résultats des évaluations passées en cours de formation lorsque le candidat évalué est issu d’un parcours de formation</w:t>
             </w:r>
           </w:p>
           <w:p>
@@ -1575,16 +1538,7 @@
                 <w:sz w:val="20"/>
                 <w:szCs w:val="20"/>
               </w:rPr>
-              <w:t>De</w:t>
-            </w:r>
-            <w:r>
-              <w:rPr>
-                <w:rFonts w:cstheme="minorHAnsi"/>
-                <w:color w:val="404040" w:themeColor="text1" w:themeTint="BF"/>
-                <w:sz w:val="20"/>
-                <w:szCs w:val="20"/>
-              </w:rPr>
-              <w:t xml:space="preserve"> l’entretien final (dans le cadre de la session titre).</w:t>
+              <w:t xml:space="preserve">De l’entretien final (dans le cadre de la session titre).</w:t>
             </w:r>
           </w:p>
           <w:p>
@@ -1672,17 +1626,7 @@
                 <w:sz w:val="18"/>
                 <w:szCs w:val="18"/>
               </w:rPr>
-              <w:t>Du</w:t>
-            </w:r>
-            <w:r>
-              <w:rPr>
-                <w:rFonts w:cstheme="minorHAnsi"/>
-                <w:i/>
-                <w:color w:val="7F7F7F" w:themeColor="text1" w:themeTint="80"/>
-                <w:sz w:val="18"/>
-                <w:szCs w:val="18"/>
-              </w:rPr>
-              <w:t xml:space="preserve"> ministère chargé de l’Emploi]</w:t>
+              <w:t xml:space="preserve">Du ministère chargé de l’Emploi]</w:t>
             </w:r>
           </w:p>
           <w:p>
@@ -1802,15 +1746,6 @@
                   </w:pict>
                 </mc:Fallback>
               </mc:AlternateContent>
-            </w:r>
-            <w:r>
-              <w:rPr>
-                <w:rFonts w:cstheme="minorHAnsi"/>
-                <w:noProof/>
-                <w:color w:val="404040" w:themeColor="text1" w:themeTint="BF"/>
-                <w:sz w:val="20"/>
-                <w:szCs w:val="20"/>
-              </w:rPr>
               <mc:AlternateContent>
                 <mc:Choice Requires="wpi">
                   <w:drawing>
@@ -1859,16 +1794,7 @@
                 <w:sz w:val="20"/>
                 <w:szCs w:val="20"/>
               </w:rPr>
-              <w:t>Pour</w:t>
-            </w:r>
-            <w:r>
-              <w:rPr>
-                <w:rFonts w:cstheme="minorHAnsi"/>
-                <w:color w:val="404040" w:themeColor="text1" w:themeTint="BF"/>
-                <w:sz w:val="20"/>
-                <w:szCs w:val="20"/>
-              </w:rPr>
-              <w:t xml:space="preserve"> chaque activité-type du titre visé, un à trois exemples de pratique professionnelle ; </w:t>
+              <w:t xml:space="preserve">Pour chaque activité-type du titre visé, un à trois exemples de pratique professionnelle ; </w:t>
             </w:r>
           </w:p>
           <w:p>
@@ -1894,16 +1820,7 @@
                 <w:sz w:val="20"/>
                 <w:szCs w:val="20"/>
               </w:rPr>
-              <w:t>Un</w:t>
-            </w:r>
-            <w:r>
-              <w:rPr>
-                <w:rFonts w:cstheme="minorHAnsi"/>
-                <w:color w:val="404040" w:themeColor="text1" w:themeTint="BF"/>
-                <w:sz w:val="20"/>
-                <w:szCs w:val="20"/>
-              </w:rPr>
-              <w:t xml:space="preserve"> tableau à renseigner si le candidat souhaite porter à la connaissance du jury la détention d’un titre, d’un diplôme, d’un certificat de qualification professionnelle (CQP) ou des attestations de formation ;</w:t>
+              <w:t xml:space="preserve">Un tableau à renseigner si le candidat souhaite porter à la connaissance du jury la détention d’un titre, d’un diplôme, d’un certificat de qualification professionnelle (CQP) ou des attestations de formation ;</w:t>
             </w:r>
           </w:p>
           <w:p>
@@ -1929,16 +1846,7 @@
                 <w:sz w:val="20"/>
                 <w:szCs w:val="20"/>
               </w:rPr>
-              <w:t>Une</w:t>
-            </w:r>
-            <w:r>
-              <w:rPr>
-                <w:rFonts w:cstheme="minorHAnsi"/>
-                <w:color w:val="404040" w:themeColor="text1" w:themeTint="BF"/>
-                <w:sz w:val="20"/>
-                <w:szCs w:val="20"/>
-              </w:rPr>
-              <w:t xml:space="preserve"> déclaration sur l’honneur à compléter et à signer ;</w:t>
+              <w:t xml:space="preserve">Une déclaration sur l’honneur à compléter et à signer ;</w:t>
             </w:r>
           </w:p>
           <w:p>
@@ -1964,16 +1872,7 @@
                 <w:sz w:val="20"/>
                 <w:szCs w:val="20"/>
               </w:rPr>
-              <w:t>Des</w:t>
-            </w:r>
-            <w:r>
-              <w:rPr>
-                <w:rFonts w:cstheme="minorHAnsi"/>
-                <w:color w:val="404040" w:themeColor="text1" w:themeTint="BF"/>
-                <w:sz w:val="20"/>
-                <w:szCs w:val="20"/>
-              </w:rPr>
-              <w:t xml:space="preserve"> documents illustrant la pratique professionnelle du candidat (facultatif)</w:t>
+              <w:t xml:space="preserve">Des documents illustrant la pratique professionnelle du candidat (facultatif)</w:t>
             </w:r>
           </w:p>
           <w:p>
@@ -1997,16 +1896,7 @@
                 <w:sz w:val="20"/>
                 <w:szCs w:val="20"/>
               </w:rPr>
-              <w:t>Des</w:t>
-            </w:r>
-            <w:r>
-              <w:rPr>
-                <w:rFonts w:cstheme="minorHAnsi"/>
-                <w:color w:val="404040" w:themeColor="text1" w:themeTint="BF"/>
-                <w:sz w:val="20"/>
-                <w:szCs w:val="20"/>
-              </w:rPr>
-              <w:t xml:space="preserve"> annexes, si nécessaire.</w:t>
+              <w:t xml:space="preserve">Des annexes, si nécessaire.</w:t>
             </w:r>
           </w:p>
         </w:tc>
@@ -2285,27 +2175,7 @@
                 <w:sz w:val="24"/>
                 <w:szCs w:val="24"/>
               </w:rPr>
-              <w:t>Intitulé de l’activité-type n° 1</w:t>
-            </w:r>
-            <w:r>
-              <w:rPr>
-                <w:rFonts w:cstheme="minorHAnsi"/>
-                <w:b/>
-                <w:color w:val="404040" w:themeColor="text1" w:themeTint="BF"/>
-                <w:sz w:val="24"/>
-                <w:szCs w:val="24"/>
-              </w:rPr>
-              <w:t xml:space="preserve"> </w:t>
-            </w:r>
-            <w:r>
-              <w:rPr>
-                <w:rFonts w:cstheme="minorHAnsi"/>
-                <w:b/>
-                <w:color w:val="404040" w:themeColor="text1" w:themeTint="BF"/>
-                <w:sz w:val="24"/>
-                <w:szCs w:val="24"/>
-              </w:rPr>
-              <w:t>Concevoir et développer des composants d'interface utilisateur en intégrant les recommandations de sécurité</w:t>
+              <w:t xml:space="preserve">Intitulé de l’activité-type n° 1 Concevoir et développer des composants d'interface utilisateur en intégrant les recommandations de sécurité</w:t>
             </w:r>
           </w:p>
         </w:tc>
@@ -2426,14 +2296,7 @@
                 <w:rFonts w:cstheme="minorHAnsi"/>
                 <w:color w:val="404040" w:themeColor="text1" w:themeTint="BF"/>
               </w:rPr>
-              <w:t xml:space="preserve"> Intitulé de l’exemple n° </w:t>
-            </w:r>
-            <w:r>
-              <w:rPr>
-                <w:rFonts w:cstheme="minorHAnsi"/>
-                <w:color w:val="404040" w:themeColor="text1" w:themeTint="BF"/>
-              </w:rPr>
-              <w:t xml:space="preserve">1 </w:t>
+              <w:t xml:space="preserve"> Intitulé de l’exemple n° 1 </w:t>
             </w:r>
             <w:r>
               <w:rPr>
@@ -2443,29 +2306,7 @@
                 <w:szCs w:val="21"/>
                 <w:shd w:val="clear" w:color="auto" w:fill="FDFDFC"/>
               </w:rPr>
-              <w:t xml:space="preserve">Modélisation et mise en place de la base de données de </w:t>
-            </w:r>
-            <w:proofErr w:type="spellStart"/>
-            <w:r>
-              <w:rPr>
-                <w:rFonts w:ascii="Segoe UI" w:hAnsi="Segoe UI" w:cs="Segoe UI"/>
-                <w:color w:val="0A0A0A"/>
-                <w:sz w:val="21"/>
-                <w:szCs w:val="21"/>
-                <w:shd w:val="clear" w:color="auto" w:fill="FDFDFC"/>
-              </w:rPr>
-              <w:t>CongésFlow</w:t>
-            </w:r>
-            <w:proofErr w:type="spellEnd"/>
-            <w:r>
-              <w:rPr>
-                <w:rFonts w:ascii="Segoe UI" w:hAnsi="Segoe UI" w:cs="Segoe UI"/>
-                <w:color w:val="0A0A0A"/>
-                <w:sz w:val="21"/>
-                <w:szCs w:val="21"/>
-                <w:shd w:val="clear" w:color="auto" w:fill="FDFDFC"/>
-              </w:rPr>
-              <w:t> </w:t>
+              <w:t xml:space="preserve">Modélisation et mise en place de la base de données de CongésFlow </w:t>
             </w:r>
             <w:r>
               <w:rPr>
@@ -2473,12 +2314,6 @@
                 <w:color w:val="404040" w:themeColor="text1" w:themeTint="BF"/>
               </w:rPr>
               <w:tab/>
-            </w:r>
-            <w:r>
-              <w:rPr>
-                <w:rFonts w:cstheme="minorHAnsi"/>
-                <w:color w:val="404040" w:themeColor="text1" w:themeTint="BF"/>
-              </w:rPr>
               <w:t>p.</w:t>
             </w:r>
           </w:p>
@@ -2590,27 +2425,8 @@
                 <w:rFonts w:cstheme="minorHAnsi"/>
                 <w:color w:val="404040" w:themeColor="text1" w:themeTint="BF"/>
               </w:rPr>
-              <w:t xml:space="preserve"> Intitulé de l’exemple n° </w:t>
-            </w:r>
-            <w:r>
-              <w:rPr>
-                <w:rFonts w:cstheme="minorHAnsi"/>
-                <w:color w:val="404040" w:themeColor="text1" w:themeTint="BF"/>
-              </w:rPr>
-              <w:t xml:space="preserve">2 </w:t>
-            </w:r>
-            <w:r>
-              <w:rPr>
-                <w:rFonts w:cstheme="minorHAnsi"/>
-                <w:color w:val="404040" w:themeColor="text1" w:themeTint="BF"/>
-              </w:rPr>
+              <w:t xml:space="preserve"> Intitulé de l’exemple n° 2 </w:t>
               <w:tab/>
-            </w:r>
-            <w:r>
-              <w:rPr>
-                <w:rFonts w:cstheme="minorHAnsi"/>
-                <w:color w:val="404040" w:themeColor="text1" w:themeTint="BF"/>
-              </w:rPr>
               <w:t>p.</w:t>
             </w:r>
           </w:p>
@@ -2722,27 +2538,8 @@
                 <w:rFonts w:cstheme="minorHAnsi"/>
                 <w:color w:val="404040" w:themeColor="text1" w:themeTint="BF"/>
               </w:rPr>
-              <w:t xml:space="preserve"> Intitulé de l’exemple n° </w:t>
-            </w:r>
-            <w:r>
-              <w:rPr>
-                <w:rFonts w:cstheme="minorHAnsi"/>
-                <w:color w:val="404040" w:themeColor="text1" w:themeTint="BF"/>
-              </w:rPr>
-              <w:t xml:space="preserve">3 </w:t>
-            </w:r>
-            <w:r>
-              <w:rPr>
-                <w:rFonts w:cstheme="minorHAnsi"/>
-                <w:color w:val="404040" w:themeColor="text1" w:themeTint="BF"/>
-              </w:rPr>
+              <w:t xml:space="preserve"> Intitulé de l’exemple n° 3 </w:t>
               <w:tab/>
-            </w:r>
-            <w:r>
-              <w:rPr>
-                <w:rFonts w:cstheme="minorHAnsi"/>
-                <w:color w:val="404040" w:themeColor="text1" w:themeTint="BF"/>
-              </w:rPr>
               <w:t>p</w:t>
             </w:r>
           </w:p>
@@ -2922,27 +2719,7 @@
                 <w:sz w:val="24"/>
                 <w:szCs w:val="24"/>
               </w:rPr>
-              <w:t>Intitulé de l’activité-type n° 2</w:t>
-            </w:r>
-            <w:r>
-              <w:rPr>
-                <w:rFonts w:cstheme="minorHAnsi"/>
-                <w:b/>
-                <w:color w:val="404040" w:themeColor="text1" w:themeTint="BF"/>
-                <w:sz w:val="24"/>
-                <w:szCs w:val="24"/>
-              </w:rPr>
-              <w:t xml:space="preserve"> </w:t>
-            </w:r>
-            <w:r>
-              <w:rPr>
-                <w:rFonts w:cstheme="minorHAnsi"/>
-                <w:b/>
-                <w:color w:val="404040" w:themeColor="text1" w:themeTint="BF"/>
-                <w:sz w:val="24"/>
-                <w:szCs w:val="24"/>
-              </w:rPr>
-              <w:t>Concevoir et développer la persistance des données en intégrant les recommandations de sécurité</w:t>
+              <w:t xml:space="preserve">Intitulé de l’activité-type n° 2 Concevoir et développer la persistance des données en intégrant les recommandations de sécurité</w:t>
             </w:r>
           </w:p>
         </w:tc>
@@ -3060,14 +2837,7 @@
                 <w:rFonts w:cstheme="minorHAnsi"/>
                 <w:color w:val="404040" w:themeColor="text1" w:themeTint="BF"/>
               </w:rPr>
-              <w:t xml:space="preserve"> Intitulé de l’exemple n° </w:t>
-            </w:r>
-            <w:r>
-              <w:rPr>
-                <w:rFonts w:cstheme="minorHAnsi"/>
-                <w:color w:val="404040" w:themeColor="text1" w:themeTint="BF"/>
-              </w:rPr>
-              <w:t xml:space="preserve">1 </w:t>
+              <w:t xml:space="preserve"> Intitulé de l’exemple n° 1 </w:t>
             </w:r>
             <w:r>
               <w:rPr>
@@ -3085,12 +2855,6 @@
                 <w:color w:val="404040" w:themeColor="text1" w:themeTint="BF"/>
               </w:rPr>
               <w:tab/>
-            </w:r>
-            <w:r>
-              <w:rPr>
-                <w:rFonts w:cstheme="minorHAnsi"/>
-                <w:color w:val="404040" w:themeColor="text1" w:themeTint="BF"/>
-              </w:rPr>
               <w:t>p.</w:t>
             </w:r>
           </w:p>
@@ -3207,27 +2971,8 @@
                 <w:rFonts w:cstheme="minorHAnsi"/>
                 <w:color w:val="404040" w:themeColor="text1" w:themeTint="BF"/>
               </w:rPr>
-              <w:t xml:space="preserve"> Intitulé de l’exemple n° </w:t>
-            </w:r>
-            <w:r>
-              <w:rPr>
-                <w:rFonts w:cstheme="minorHAnsi"/>
-                <w:color w:val="404040" w:themeColor="text1" w:themeTint="BF"/>
-              </w:rPr>
-              <w:t xml:space="preserve">2 </w:t>
-            </w:r>
-            <w:r>
-              <w:rPr>
-                <w:rFonts w:cstheme="minorHAnsi"/>
-                <w:color w:val="404040" w:themeColor="text1" w:themeTint="BF"/>
-              </w:rPr>
+              <w:t xml:space="preserve"> Intitulé de l’exemple n° 2 </w:t>
               <w:tab/>
-            </w:r>
-            <w:r>
-              <w:rPr>
-                <w:rFonts w:cstheme="minorHAnsi"/>
-                <w:color w:val="404040" w:themeColor="text1" w:themeTint="BF"/>
-              </w:rPr>
               <w:t>p.</w:t>
             </w:r>
           </w:p>
@@ -3345,27 +3090,8 @@
                 <w:rFonts w:cstheme="minorHAnsi"/>
                 <w:color w:val="404040" w:themeColor="text1" w:themeTint="BF"/>
               </w:rPr>
-              <w:t xml:space="preserve"> Intitulé de l’exemple n° </w:t>
-            </w:r>
-            <w:r>
-              <w:rPr>
-                <w:rFonts w:cstheme="minorHAnsi"/>
-                <w:color w:val="404040" w:themeColor="text1" w:themeTint="BF"/>
-              </w:rPr>
-              <w:t xml:space="preserve">3 </w:t>
-            </w:r>
-            <w:r>
-              <w:rPr>
-                <w:rFonts w:cstheme="minorHAnsi"/>
-                <w:color w:val="404040" w:themeColor="text1" w:themeTint="BF"/>
-              </w:rPr>
+              <w:t xml:space="preserve"> Intitulé de l’exemple n° 3 </w:t>
               <w:tab/>
-            </w:r>
-            <w:r>
-              <w:rPr>
-                <w:rFonts w:cstheme="minorHAnsi"/>
-                <w:color w:val="404040" w:themeColor="text1" w:themeTint="BF"/>
-              </w:rPr>
               <w:t>p</w:t>
             </w:r>
           </w:p>
@@ -3547,27 +3273,7 @@
                 <w:sz w:val="24"/>
                 <w:szCs w:val="24"/>
               </w:rPr>
-              <w:t>Intitulé de l’activité-type n° 3</w:t>
-            </w:r>
-            <w:r>
-              <w:rPr>
-                <w:rFonts w:cstheme="minorHAnsi"/>
-                <w:b/>
-                <w:color w:val="404040" w:themeColor="text1" w:themeTint="BF"/>
-                <w:sz w:val="24"/>
-                <w:szCs w:val="24"/>
-              </w:rPr>
-              <w:t xml:space="preserve"> </w:t>
-            </w:r>
-            <w:r>
-              <w:rPr>
-                <w:rFonts w:cstheme="minorHAnsi"/>
-                <w:b/>
-                <w:color w:val="404040" w:themeColor="text1" w:themeTint="BF"/>
-                <w:sz w:val="24"/>
-                <w:szCs w:val="24"/>
-              </w:rPr>
-              <w:t>Concevoir et développer une application multicouche répartie en intégrant les recommandations de sécurité</w:t>
+              <w:t xml:space="preserve">Intitulé de l’activité-type n° 3 Concevoir et développer une application multicouche répartie en intégrant les recommandations de sécurité</w:t>
             </w:r>
           </w:p>
         </w:tc>
@@ -3687,14 +3393,7 @@
                 <w:rFonts w:cstheme="minorHAnsi"/>
                 <w:color w:val="404040" w:themeColor="text1" w:themeTint="BF"/>
               </w:rPr>
-              <w:t xml:space="preserve"> Intitulé de l’exemple n° </w:t>
-            </w:r>
-            <w:r>
-              <w:rPr>
-                <w:rFonts w:cstheme="minorHAnsi"/>
-                <w:color w:val="404040" w:themeColor="text1" w:themeTint="BF"/>
-              </w:rPr>
-              <w:t xml:space="preserve">1 </w:t>
+              <w:t xml:space="preserve"> Intitulé de l’exemple n° 1 </w:t>
             </w:r>
             <w:r>
               <w:rPr>
@@ -3704,32 +3403,14 @@
                 <w:szCs w:val="21"/>
                 <w:shd w:val="clear" w:color="auto" w:fill="FDFDFC"/>
               </w:rPr>
-              <w:t xml:space="preserve">Conception, développement et déploiement de l'application </w:t>
-            </w:r>
-            <w:proofErr w:type="spellStart"/>
-            <w:r>
-              <w:rPr>
-                <w:rFonts w:ascii="Segoe UI" w:hAnsi="Segoe UI" w:cs="Segoe UI"/>
-                <w:color w:val="0A0A0A"/>
-                <w:sz w:val="21"/>
-                <w:szCs w:val="21"/>
-                <w:shd w:val="clear" w:color="auto" w:fill="FDFDFC"/>
-              </w:rPr>
-              <w:t>CongésFlow</w:t>
-            </w:r>
-            <w:proofErr w:type="spellEnd"/>
+              <w:t xml:space="preserve">Conception, développement et déploiement de l'application CongésFlow</w:t>
+            </w:r>
             <w:r>
               <w:rPr>
                 <w:rFonts w:cstheme="minorHAnsi"/>
                 <w:color w:val="404040" w:themeColor="text1" w:themeTint="BF"/>
               </w:rPr>
               <w:tab/>
-            </w:r>
-            <w:r>
-              <w:rPr>
-                <w:rFonts w:cstheme="minorHAnsi"/>
-                <w:color w:val="404040" w:themeColor="text1" w:themeTint="BF"/>
-              </w:rPr>
               <w:t>p.</w:t>
             </w:r>
           </w:p>
@@ -3850,27 +3531,8 @@
                 <w:rFonts w:cstheme="minorHAnsi"/>
                 <w:color w:val="404040" w:themeColor="text1" w:themeTint="BF"/>
               </w:rPr>
-              <w:t xml:space="preserve"> Intitulé de l’exemple n° </w:t>
-            </w:r>
-            <w:r>
-              <w:rPr>
-                <w:rFonts w:cstheme="minorHAnsi"/>
-                <w:color w:val="404040" w:themeColor="text1" w:themeTint="BF"/>
-              </w:rPr>
-              <w:t xml:space="preserve">2 </w:t>
-            </w:r>
-            <w:r>
-              <w:rPr>
-                <w:rFonts w:cstheme="minorHAnsi"/>
-                <w:color w:val="404040" w:themeColor="text1" w:themeTint="BF"/>
-              </w:rPr>
+              <w:t xml:space="preserve"> Intitulé de l’exemple n° 2 </w:t>
               <w:tab/>
-            </w:r>
-            <w:r>
-              <w:rPr>
-                <w:rFonts w:cstheme="minorHAnsi"/>
-                <w:color w:val="404040" w:themeColor="text1" w:themeTint="BF"/>
-              </w:rPr>
               <w:t>p.</w:t>
             </w:r>
           </w:p>
@@ -3991,27 +3653,8 @@
                 <w:rFonts w:cstheme="minorHAnsi"/>
                 <w:color w:val="404040" w:themeColor="text1" w:themeTint="BF"/>
               </w:rPr>
-              <w:t xml:space="preserve"> Intitulé de l’exemple n° </w:t>
-            </w:r>
-            <w:r>
-              <w:rPr>
-                <w:rFonts w:cstheme="minorHAnsi"/>
-                <w:color w:val="404040" w:themeColor="text1" w:themeTint="BF"/>
-              </w:rPr>
-              <w:t xml:space="preserve">3 </w:t>
-            </w:r>
-            <w:r>
-              <w:rPr>
-                <w:rFonts w:cstheme="minorHAnsi"/>
-                <w:color w:val="404040" w:themeColor="text1" w:themeTint="BF"/>
-              </w:rPr>
+              <w:t xml:space="preserve"> Intitulé de l’exemple n° 3 </w:t>
               <w:tab/>
-            </w:r>
-            <w:r>
-              <w:rPr>
-                <w:rFonts w:cstheme="minorHAnsi"/>
-                <w:color w:val="404040" w:themeColor="text1" w:themeTint="BF"/>
-              </w:rPr>
               <w:t>p</w:t>
             </w:r>
           </w:p>
@@ -4313,27 +3956,8 @@
                 <w:rFonts w:cstheme="minorHAnsi"/>
                 <w:color w:val="404040" w:themeColor="text1" w:themeTint="BF"/>
               </w:rPr>
-              <w:t xml:space="preserve"> Intitulé de l’exemple n° </w:t>
-            </w:r>
-            <w:r>
-              <w:rPr>
-                <w:rFonts w:cstheme="minorHAnsi"/>
-                <w:color w:val="404040" w:themeColor="text1" w:themeTint="BF"/>
-              </w:rPr>
-              <w:t xml:space="preserve">1 </w:t>
-            </w:r>
-            <w:r>
-              <w:rPr>
-                <w:rFonts w:cstheme="minorHAnsi"/>
-                <w:color w:val="404040" w:themeColor="text1" w:themeTint="BF"/>
-              </w:rPr>
+              <w:t xml:space="preserve"> Intitulé de l’exemple n° 1 </w:t>
               <w:tab/>
-            </w:r>
-            <w:r>
-              <w:rPr>
-                <w:rFonts w:cstheme="minorHAnsi"/>
-                <w:color w:val="404040" w:themeColor="text1" w:themeTint="BF"/>
-              </w:rPr>
               <w:t>p.</w:t>
             </w:r>
           </w:p>
@@ -4454,27 +4078,8 @@
                 <w:rFonts w:cstheme="minorHAnsi"/>
                 <w:color w:val="404040" w:themeColor="text1" w:themeTint="BF"/>
               </w:rPr>
-              <w:t xml:space="preserve"> Intitulé de l’exemple n° </w:t>
-            </w:r>
-            <w:r>
-              <w:rPr>
-                <w:rFonts w:cstheme="minorHAnsi"/>
-                <w:color w:val="404040" w:themeColor="text1" w:themeTint="BF"/>
-              </w:rPr>
-              <w:t xml:space="preserve">2 </w:t>
-            </w:r>
-            <w:r>
-              <w:rPr>
-                <w:rFonts w:cstheme="minorHAnsi"/>
-                <w:color w:val="404040" w:themeColor="text1" w:themeTint="BF"/>
-              </w:rPr>
+              <w:t xml:space="preserve"> Intitulé de l’exemple n° 2 </w:t>
               <w:tab/>
-            </w:r>
-            <w:r>
-              <w:rPr>
-                <w:rFonts w:cstheme="minorHAnsi"/>
-                <w:color w:val="404040" w:themeColor="text1" w:themeTint="BF"/>
-              </w:rPr>
               <w:t>p.</w:t>
             </w:r>
           </w:p>
@@ -4595,27 +4200,8 @@
                 <w:rFonts w:cstheme="minorHAnsi"/>
                 <w:color w:val="404040" w:themeColor="text1" w:themeTint="BF"/>
               </w:rPr>
-              <w:t xml:space="preserve"> Intitulé de l’exemple n° </w:t>
-            </w:r>
-            <w:r>
-              <w:rPr>
-                <w:rFonts w:cstheme="minorHAnsi"/>
-                <w:color w:val="404040" w:themeColor="text1" w:themeTint="BF"/>
-              </w:rPr>
-              <w:t xml:space="preserve">3 </w:t>
-            </w:r>
-            <w:r>
-              <w:rPr>
-                <w:rFonts w:cstheme="minorHAnsi"/>
-                <w:color w:val="404040" w:themeColor="text1" w:themeTint="BF"/>
-              </w:rPr>
+              <w:t xml:space="preserve"> Intitulé de l’exemple n° 3 </w:t>
               <w:tab/>
-            </w:r>
-            <w:r>
-              <w:rPr>
-                <w:rFonts w:cstheme="minorHAnsi"/>
-                <w:color w:val="404040" w:themeColor="text1" w:themeTint="BF"/>
-              </w:rPr>
               <w:t>p</w:t>
             </w:r>
           </w:p>
@@ -5582,18 +5168,8 @@
                     <w:i/>
                     <w:color w:val="000000" w:themeColor="text1"/>
                   </w:rPr>
-                  <w:t xml:space="preserve">Conception et développement de l'interface web de </w:t>
+                  <w:t xml:space="preserve">Conception et développement de l'interface web de CongésFlow</w:t>
                 </w:r>
-                <w:proofErr w:type="spellStart"/>
-                <w:r>
-                  <w:rPr>
-                    <w:rStyle w:val="Textedelespacerserv"/>
-                    <w:i/>
-                    <w:color w:val="000000" w:themeColor="text1"/>
-                  </w:rPr>
-                  <w:t>CongésFlow</w:t>
-                </w:r>
-                <w:proofErr w:type="spellEnd"/>
               </w:p>
             </w:tc>
           </w:sdtContent>
@@ -5702,187 +5278,15 @@
                 <w:color w:val="1B2A3A"/>
                 <w:sz w:val="20"/>
               </w:rPr>
-              <w:t xml:space="preserve">•  Dans le cadre du projet </w:t>
-            </w:r>
-            <w:proofErr w:type="spellStart"/>
-            <w:r>
-              <w:rPr>
-                <w:rFonts w:cstheme="minorHAnsi"/>
-                <w:color w:val="1B2A3A"/>
-                <w:sz w:val="20"/>
-              </w:rPr>
-              <w:t>CongésFlow</w:t>
-            </w:r>
-            <w:proofErr w:type="spellEnd"/>
-            <w:r>
-              <w:rPr>
-                <w:rFonts w:cstheme="minorHAnsi"/>
-                <w:color w:val="1B2A3A"/>
-                <w:sz w:val="20"/>
-              </w:rPr>
-              <w:t xml:space="preserve"> (application web de gestion des congés), j'ai conçu et développé l'interface utilisateur.</w:t>
-            </w:r>
-            <w:r>
-              <w:rPr>
-                <w:rFonts w:cstheme="minorHAnsi"/>
-                <w:color w:val="1B2A3A"/>
-                <w:sz w:val="20"/>
-              </w:rPr>
+              <w:t xml:space="preserve">•  Dans le cadre du projet CongésFlow (application web de gestion des congés), j'ai conçu et développé l'interface utilisateur.</w:t>
               <w:br/>
-              <w:t xml:space="preserve">•  J'ai d'abord réalisé les maquettes des écrans sous </w:t>
-            </w:r>
-            <w:proofErr w:type="spellStart"/>
-            <w:r>
-              <w:rPr>
-                <w:rFonts w:cstheme="minorHAnsi"/>
-                <w:color w:val="1B2A3A"/>
-                <w:sz w:val="20"/>
-              </w:rPr>
-              <w:t>Figma</w:t>
-            </w:r>
-            <w:proofErr w:type="spellEnd"/>
-            <w:r>
-              <w:rPr>
-                <w:rFonts w:cstheme="minorHAnsi"/>
-                <w:color w:val="1B2A3A"/>
-                <w:sz w:val="20"/>
-              </w:rPr>
-              <w:t xml:space="preserve"> (connexion, tableau de bord, validation), puis développé l'interface en </w:t>
-            </w:r>
-            <w:proofErr w:type="spellStart"/>
-            <w:r>
-              <w:rPr>
-                <w:rFonts w:cstheme="minorHAnsi"/>
-                <w:color w:val="1B2A3A"/>
-                <w:sz w:val="20"/>
-              </w:rPr>
-              <w:t>React</w:t>
-            </w:r>
-            <w:proofErr w:type="spellEnd"/>
-            <w:r>
-              <w:rPr>
-                <w:rFonts w:cstheme="minorHAnsi"/>
-                <w:color w:val="1B2A3A"/>
-                <w:sz w:val="20"/>
-              </w:rPr>
-              <w:t xml:space="preserve"> et </w:t>
-            </w:r>
-            <w:proofErr w:type="spellStart"/>
-            <w:r>
-              <w:rPr>
-                <w:rFonts w:cstheme="minorHAnsi"/>
-                <w:color w:val="1B2A3A"/>
-                <w:sz w:val="20"/>
-              </w:rPr>
-              <w:t>TypeScript</w:t>
-            </w:r>
-            <w:proofErr w:type="spellEnd"/>
-            <w:r>
-              <w:rPr>
-                <w:rFonts w:cstheme="minorHAnsi"/>
-                <w:color w:val="1B2A3A"/>
-                <w:sz w:val="20"/>
-              </w:rPr>
-              <w:t xml:space="preserve"> : composants réutilisables (formulaire de demande, badges de statut), mise en page responsive avec </w:t>
-            </w:r>
-            <w:proofErr w:type="spellStart"/>
-            <w:r>
-              <w:rPr>
-                <w:rFonts w:cstheme="minorHAnsi"/>
-                <w:color w:val="1B2A3A"/>
-                <w:sz w:val="20"/>
-              </w:rPr>
-              <w:t>Tailwind</w:t>
-            </w:r>
-            <w:proofErr w:type="spellEnd"/>
-            <w:r>
-              <w:rPr>
-                <w:rFonts w:cstheme="minorHAnsi"/>
-                <w:color w:val="1B2A3A"/>
-                <w:sz w:val="20"/>
-              </w:rPr>
-              <w:t xml:space="preserve"> CSS.</w:t>
-            </w:r>
-            <w:r>
-              <w:rPr>
-                <w:rFonts w:cstheme="minorHAnsi"/>
-                <w:color w:val="1B2A3A"/>
-                <w:sz w:val="20"/>
-              </w:rPr>
+              <w:t xml:space="preserve">•  J'ai d'abord réalisé les maquettes des écrans sous Figma (connexion, tableau de bord, validation), puis développé l'interface en React et TypeScript : composants réutilisables (formulaire de demande, badges de statut), mise en page responsive avec Tailwind CSS.</w:t>
               <w:br/>
-              <w:t xml:space="preserve">•  J'ai mis en place la gestion de l'état serveur avec </w:t>
-            </w:r>
-            <w:proofErr w:type="spellStart"/>
-            <w:r>
-              <w:rPr>
-                <w:rFonts w:cstheme="minorHAnsi"/>
-                <w:color w:val="1B2A3A"/>
-                <w:sz w:val="20"/>
-              </w:rPr>
-              <w:t>React</w:t>
-            </w:r>
-            <w:proofErr w:type="spellEnd"/>
-            <w:r>
-              <w:rPr>
-                <w:rFonts w:cstheme="minorHAnsi"/>
-                <w:color w:val="1B2A3A"/>
-                <w:sz w:val="20"/>
-              </w:rPr>
-              <w:t xml:space="preserve"> Query et la consommation de l'API REST via Axios.</w:t>
-            </w:r>
-            <w:r>
-              <w:rPr>
-                <w:rFonts w:cstheme="minorHAnsi"/>
-                <w:color w:val="1B2A3A"/>
-                <w:sz w:val="20"/>
-              </w:rPr>
+              <w:t xml:space="preserve">•  J'ai mis en place la gestion de l'état serveur avec React Query et la consommation de l'API REST via Axios.</w:t>
               <w:br/>
-              <w:t xml:space="preserve">•  Côté sécurité, j'ai injecté le jeton JWT à chaque requête, déclenché une déconnexion automatique en cas de réponse 401, et protégé les routes selon le rôle de l'utilisateur (composant </w:t>
-            </w:r>
-            <w:proofErr w:type="spellStart"/>
-            <w:r>
-              <w:rPr>
-                <w:rFonts w:cstheme="minorHAnsi"/>
-                <w:color w:val="1B2A3A"/>
-                <w:sz w:val="20"/>
-              </w:rPr>
-              <w:t>ProtectedRoute</w:t>
-            </w:r>
-            <w:proofErr w:type="spellEnd"/>
-            <w:r>
-              <w:rPr>
-                <w:rFonts w:cstheme="minorHAnsi"/>
-                <w:color w:val="1B2A3A"/>
-                <w:sz w:val="20"/>
-              </w:rPr>
-              <w:t>).</w:t>
-            </w:r>
-            <w:r>
-              <w:rPr>
-                <w:rFonts w:cstheme="minorHAnsi"/>
-                <w:color w:val="1B2A3A"/>
-                <w:sz w:val="20"/>
-              </w:rPr>
+              <w:t xml:space="preserve">•  Côté sécurité, j'ai injecté le jeton JWT à chaque requête, déclenché une déconnexion automatique en cas de réponse 401, et protégé les routes selon le rôle de l'utilisateur (composant ProtectedRoute).</w:t>
               <w:br/>
-              <w:t xml:space="preserve">•  Travail réalisé en autonomie, en centre de formation, sur </w:t>
-            </w:r>
-            <w:proofErr w:type="spellStart"/>
-            <w:r>
-              <w:rPr>
-                <w:rFonts w:cstheme="minorHAnsi"/>
-                <w:color w:val="1B2A3A"/>
-                <w:sz w:val="20"/>
-              </w:rPr>
-              <w:t>macOS</w:t>
-            </w:r>
-            <w:proofErr w:type="spellEnd"/>
-            <w:r>
-              <w:rPr>
-                <w:rFonts w:cstheme="minorHAnsi"/>
-                <w:color w:val="1B2A3A"/>
-                <w:sz w:val="20"/>
-              </w:rPr>
-              <w:t xml:space="preserve"> avec Visual Studio Code.</w:t>
+              <w:t xml:space="preserve">•  Travail réalisé en autonomie, en centre de formation, sur macOS avec Visual Studio Code.</w:t>
             </w:r>
           </w:p>
         </w:tc>
@@ -6041,124 +5445,9 @@
                 <w:color w:val="1B2A3A"/>
                 <w:sz w:val="20"/>
               </w:rPr>
-              <w:t xml:space="preserve">•  Langages et bibliothèques : </w:t>
-            </w:r>
-            <w:proofErr w:type="spellStart"/>
-            <w:r>
-              <w:rPr>
-                <w:rFonts w:cstheme="minorHAnsi"/>
-                <w:color w:val="1B2A3A"/>
-                <w:sz w:val="20"/>
-              </w:rPr>
-              <w:t>React</w:t>
-            </w:r>
-            <w:proofErr w:type="spellEnd"/>
-            <w:r>
-              <w:rPr>
-                <w:rFonts w:cstheme="minorHAnsi"/>
-                <w:color w:val="1B2A3A"/>
-                <w:sz w:val="20"/>
-              </w:rPr>
-              <w:t xml:space="preserve">, </w:t>
-            </w:r>
-            <w:proofErr w:type="spellStart"/>
-            <w:r>
-              <w:rPr>
-                <w:rFonts w:cstheme="minorHAnsi"/>
-                <w:color w:val="1B2A3A"/>
-                <w:sz w:val="20"/>
-              </w:rPr>
-              <w:t>TypeScript</w:t>
-            </w:r>
-            <w:proofErr w:type="spellEnd"/>
-            <w:r>
-              <w:rPr>
-                <w:rFonts w:cstheme="minorHAnsi"/>
-                <w:color w:val="1B2A3A"/>
-                <w:sz w:val="20"/>
-              </w:rPr>
-              <w:t xml:space="preserve">, Vite, </w:t>
-            </w:r>
-            <w:proofErr w:type="spellStart"/>
-            <w:r>
-              <w:rPr>
-                <w:rFonts w:cstheme="minorHAnsi"/>
-                <w:color w:val="1B2A3A"/>
-                <w:sz w:val="20"/>
-              </w:rPr>
-              <w:t>Tailwind</w:t>
-            </w:r>
-            <w:proofErr w:type="spellEnd"/>
-            <w:r>
-              <w:rPr>
-                <w:rFonts w:cstheme="minorHAnsi"/>
-                <w:color w:val="1B2A3A"/>
-                <w:sz w:val="20"/>
-              </w:rPr>
-              <w:t xml:space="preserve"> CSS, </w:t>
-            </w:r>
-            <w:proofErr w:type="spellStart"/>
-            <w:r>
-              <w:rPr>
-                <w:rFonts w:cstheme="minorHAnsi"/>
-                <w:color w:val="1B2A3A"/>
-                <w:sz w:val="20"/>
-              </w:rPr>
-              <w:t>React</w:t>
-            </w:r>
-            <w:proofErr w:type="spellEnd"/>
-            <w:r>
-              <w:rPr>
-                <w:rFonts w:cstheme="minorHAnsi"/>
-                <w:color w:val="1B2A3A"/>
-                <w:sz w:val="20"/>
-              </w:rPr>
-              <w:t xml:space="preserve"> Query, Axios.</w:t>
-            </w:r>
-            <w:r>
-              <w:rPr>
-                <w:rFonts w:cstheme="minorHAnsi"/>
-                <w:color w:val="1B2A3A"/>
-                <w:sz w:val="20"/>
-              </w:rPr>
+              <w:t xml:space="preserve">•  Langages et bibliothèques : React, TypeScript, Vite, Tailwind CSS, React Query, Axios.</w:t>
               <w:br/>
-              <w:t xml:space="preserve">• Outils : </w:t>
-            </w:r>
-            <w:proofErr w:type="spellStart"/>
-            <w:r>
-              <w:rPr>
-                <w:rFonts w:cstheme="minorHAnsi"/>
-                <w:color w:val="1B2A3A"/>
-                <w:sz w:val="20"/>
-              </w:rPr>
-              <w:t>Figma</w:t>
-            </w:r>
-            <w:proofErr w:type="spellEnd"/>
-            <w:r>
-              <w:rPr>
-                <w:rFonts w:cstheme="minorHAnsi"/>
-                <w:color w:val="1B2A3A"/>
-                <w:sz w:val="20"/>
-              </w:rPr>
-              <w:t xml:space="preserve"> (maquettes), Git et GitHub (</w:t>
-            </w:r>
-            <w:proofErr w:type="spellStart"/>
-            <w:r>
-              <w:rPr>
-                <w:rFonts w:cstheme="minorHAnsi"/>
-                <w:color w:val="1B2A3A"/>
-                <w:sz w:val="20"/>
-              </w:rPr>
-              <w:t>versionnement</w:t>
-            </w:r>
-            <w:proofErr w:type="spellEnd"/>
-            <w:r>
-              <w:rPr>
-                <w:rFonts w:cstheme="minorHAnsi"/>
-                <w:color w:val="1B2A3A"/>
-                <w:sz w:val="20"/>
-              </w:rPr>
-              <w:t>), navigateur et outils de développement, VS Code.</w:t>
+              <w:t xml:space="preserve">• Outils : Figma (maquettes), Git et GitHub (versionnement), navigateur et outils de développement, VS Code.</w:t>
             </w:r>
           </w:p>
         </w:tc>
@@ -6314,13 +5603,6 @@
                 <w:sz w:val="20"/>
               </w:rPr>
               <w:t>•  Projet individuel réalisé en centre de formation, sous l'encadrement de M'hand BOUFALA (ESTIAM).</w:t>
-            </w:r>
-            <w:r>
-              <w:rPr>
-                <w:rFonts w:cstheme="minorHAnsi"/>
-                <w:color w:val="1B2A3A"/>
-                <w:sz w:val="20"/>
-              </w:rPr>
               <w:br/>
               <w:t>• Échanges réguliers avec l'équipe pédagogique pour la validation des choix.</w:t>
             </w:r>
@@ -6586,23 +5868,13 @@
                     <w:sz w:val="24"/>
                   </w:rPr>
                 </w:pPr>
-                <w:proofErr w:type="spellStart"/>
                 <w:r>
                   <w:rPr>
                     <w:rFonts w:cstheme="minorHAnsi"/>
                     <w:i/>
                     <w:color w:val="000000" w:themeColor="text1"/>
                   </w:rPr>
-                  <w:t>Estiam</w:t>
-                </w:r>
-                <w:proofErr w:type="spellEnd"/>
-                <w:r>
-                  <w:rPr>
-                    <w:rFonts w:cstheme="minorHAnsi"/>
-                    <w:i/>
-                    <w:color w:val="000000" w:themeColor="text1"/>
-                  </w:rPr>
-                  <w:t xml:space="preserve"> Paris</w:t>
+                  <w:t xml:space="preserve">Estiam Paris</w:t>
                 </w:r>
               </w:p>
             </w:tc>
@@ -6695,15 +5967,7 @@
                     <w:color w:val="1B2A3A"/>
                     <w:sz w:val="20"/>
                   </w:rPr>
-                  <w:t>Projet</w:t>
-                </w:r>
-                <w:r>
-                  <w:rPr>
-                    <w:rFonts w:cstheme="minorHAnsi"/>
-                    <w:color w:val="1B2A3A"/>
-                    <w:sz w:val="20"/>
-                  </w:rPr>
-                  <w:t xml:space="preserve"> de fin d'études — Concepteur Développeur d'Applications</w:t>
+                  <w:t xml:space="preserve">Projet de fin d'études — Concepteur Développeur d'Applications</w:t>
                 </w:r>
               </w:sdtContent>
             </w:sdt>
@@ -6738,14 +6002,7 @@
                 <w:rFonts w:cstheme="minorHAnsi"/>
                 <w:color w:val="404040" w:themeColor="text1" w:themeTint="BF"/>
               </w:rPr>
-              <w:t xml:space="preserve">Période </w:t>
-            </w:r>
-            <w:r>
-              <w:rPr>
-                <w:rFonts w:cstheme="minorHAnsi"/>
-                <w:color w:val="404040" w:themeColor="text1" w:themeTint="BF"/>
-              </w:rPr>
-              <w:t>d’exercice</w:t>
+              <w:t xml:space="preserve">Période d’exercice</w:t>
             </w:r>
             <w:r>
               <w:rPr>
@@ -6754,13 +6011,6 @@
                 <w:color w:val="404040" w:themeColor="text1" w:themeTint="BF"/>
               </w:rPr>
               <w:t xml:space="preserve"> </w:t>
-            </w:r>
-            <w:r>
-              <w:rPr>
-                <w:rFonts w:cstheme="minorHAnsi"/>
-                <w:b/>
-                <w:color w:val="404040" w:themeColor="text1" w:themeTint="BF"/>
-              </w:rPr>
               <w:tab/>
             </w:r>
             <w:r>
@@ -6772,51 +6022,7 @@
                 <w:szCs w:val="12"/>
                 <w:lang w:eastAsia="fr-FR"/>
               </w:rPr>
-              <w:t></w:t>
-            </w:r>
-            <w:r>
-              <w:rPr>
-                <w:rFonts w:ascii="Wingdings 3" w:hAnsi="Wingdings 3" w:cstheme="minorHAnsi"/>
-                <w:noProof/>
-                <w:color w:val="D60093"/>
-                <w:sz w:val="12"/>
-                <w:szCs w:val="12"/>
-                <w:lang w:eastAsia="fr-FR"/>
-              </w:rPr>
-              <w:t></w:t>
-            </w:r>
-            <w:r>
-              <w:rPr>
-                <w:rFonts w:ascii="Wingdings 3" w:hAnsi="Wingdings 3" w:cstheme="minorHAnsi"/>
-                <w:noProof/>
-                <w:color w:val="D60093"/>
-                <w:sz w:val="12"/>
-                <w:szCs w:val="12"/>
-                <w:lang w:eastAsia="fr-FR"/>
-              </w:rPr>
-              <w:t></w:t>
-            </w:r>
-            <w:r>
-              <w:rPr>
-                <w:rFonts w:ascii="Wingdings 3" w:hAnsi="Wingdings 3" w:cstheme="minorHAnsi"/>
-                <w:noProof/>
-                <w:color w:val="D60093"/>
-                <w:sz w:val="12"/>
-                <w:szCs w:val="12"/>
-                <w:lang w:eastAsia="fr-FR"/>
-              </w:rPr>
-              <w:t></w:t>
-            </w:r>
-            <w:r>
-              <w:rPr>
-                <w:rFonts w:ascii="Wingdings 3" w:hAnsi="Wingdings 3" w:cstheme="minorHAnsi"/>
-                <w:noProof/>
-                <w:color w:val="D60093"/>
-                <w:sz w:val="12"/>
-                <w:szCs w:val="12"/>
-                <w:lang w:eastAsia="fr-FR"/>
-              </w:rPr>
-              <w:t></w:t>
+              <w:t></w:t>
             </w:r>
             <w:r>
               <w:rPr>
@@ -6824,12 +6030,6 @@
                 <w:color w:val="404040" w:themeColor="text1" w:themeTint="BF"/>
               </w:rPr>
               <w:t>Du :</w:t>
-            </w:r>
-            <w:r>
-              <w:rPr>
-                <w:rFonts w:cstheme="minorHAnsi"/>
-                <w:color w:val="404040" w:themeColor="text1" w:themeTint="BF"/>
-              </w:rPr>
               <w:tab/>
             </w:r>
             <w:sdt>
@@ -7064,15 +6264,7 @@
                 <w:color w:val="1B2A3A"/>
                 <w:sz w:val="20"/>
               </w:rPr>
-              <w:t>I</w:t>
-            </w:r>
-            <w:r>
-              <w:rPr>
-                <w:rFonts w:cstheme="minorHAnsi"/>
-                <w:color w:val="1B2A3A"/>
-                <w:sz w:val="20"/>
-              </w:rPr>
-              <w:t>nterface responsive ; parcours de demande pensée pour être réalisé en moins de trois clics.</w:t>
+              <w:t>Interface responsive ; parcours de demande pensée pour être réalisé en moins de trois clics.</w:t>
             </w:r>
           </w:p>
         </w:tc>
@@ -7371,18 +6563,8 @@
                     <w:i/>
                     <w:color w:val="000000" w:themeColor="text1"/>
                   </w:rPr>
-                  <w:t xml:space="preserve">Modélisation et mise en place de la base de données de </w:t>
+                  <w:t xml:space="preserve">Modélisation et mise en place de la base de données de CongésFlow</w:t>
                 </w:r>
-                <w:proofErr w:type="spellStart"/>
-                <w:r>
-                  <w:rPr>
-                    <w:rStyle w:val="Textedelespacerserv"/>
-                    <w:i/>
-                    <w:color w:val="000000" w:themeColor="text1"/>
-                  </w:rPr>
-                  <w:t>CongésFlow</w:t>
-                </w:r>
-                <w:proofErr w:type="spellEnd"/>
               </w:p>
             </w:tc>
           </w:sdtContent>
@@ -7491,77 +6673,13 @@
                 <w:color w:val="1B2A3A"/>
                 <w:sz w:val="20"/>
               </w:rPr>
-              <w:t xml:space="preserve">•  Pour </w:t>
-            </w:r>
-            <w:proofErr w:type="spellStart"/>
-            <w:r>
-              <w:rPr>
-                <w:rFonts w:cstheme="minorHAnsi"/>
-                <w:color w:val="1B2A3A"/>
-                <w:sz w:val="20"/>
-              </w:rPr>
-              <w:t>CongésFlow</w:t>
-            </w:r>
-            <w:proofErr w:type="spellEnd"/>
-            <w:r>
-              <w:rPr>
-                <w:rFonts w:cstheme="minorHAnsi"/>
-                <w:color w:val="1B2A3A"/>
-                <w:sz w:val="20"/>
-              </w:rPr>
-              <w:t>, j'ai conçu et mis en place la persistance des données.</w:t>
-            </w:r>
-            <w:r>
-              <w:rPr>
-                <w:rFonts w:cstheme="minorHAnsi"/>
-                <w:color w:val="1B2A3A"/>
-                <w:sz w:val="20"/>
-              </w:rPr>
+              <w:t xml:space="preserve">•  Pour CongésFlow, j'ai conçu et mis en place la persistance des données.</w:t>
               <w:br/>
               <w:t>•  J'ai élaboré le modèle conceptuel (MCD) puis le modèle logique (MLD) : entités (Employé, Demande, Solde, Type d'absence, Service), relations et cardinalités.</w:t>
-            </w:r>
-            <w:r>
-              <w:rPr>
-                <w:rFonts w:cstheme="minorHAnsi"/>
-                <w:color w:val="1B2A3A"/>
-                <w:sz w:val="20"/>
-              </w:rPr>
               <w:br/>
               <w:t>•  J'ai écrit le modèle physique en SQL pour PostgreSQL : clés primaires et étrangères, contraintes UNIQUE, NOT NULL et CHECK, index sur les colonnes filtrées.</w:t>
-            </w:r>
-            <w:r>
-              <w:rPr>
-                <w:rFonts w:cstheme="minorHAnsi"/>
-                <w:color w:val="1B2A3A"/>
-                <w:sz w:val="20"/>
-              </w:rPr>
               <w:br/>
-              <w:t xml:space="preserve">•  J'ai mis en place l'accès aux données via l'ORM </w:t>
-            </w:r>
-            <w:proofErr w:type="spellStart"/>
-            <w:r>
-              <w:rPr>
-                <w:rFonts w:cstheme="minorHAnsi"/>
-                <w:color w:val="1B2A3A"/>
-                <w:sz w:val="20"/>
-              </w:rPr>
-              <w:t>SQLAlchemy</w:t>
-            </w:r>
-            <w:proofErr w:type="spellEnd"/>
-            <w:r>
-              <w:rPr>
-                <w:rFonts w:cstheme="minorHAnsi"/>
-                <w:color w:val="1B2A3A"/>
-                <w:sz w:val="20"/>
-              </w:rPr>
-              <w:t>, qui génère des requêtes préparées (protection contre les injections SQL), et créé un jeu de données de démonstration.</w:t>
-            </w:r>
-            <w:r>
-              <w:rPr>
-                <w:rFonts w:cstheme="minorHAnsi"/>
-                <w:color w:val="1B2A3A"/>
-                <w:sz w:val="20"/>
-              </w:rPr>
+              <w:t xml:space="preserve">•  J'ai mis en place l'accès aux données via l'ORM SQLAlchemy, qui génère des requêtes préparées (protection contre les injections SQL), et créé un jeu de données de démonstration.</w:t>
               <w:br/>
               <w:t>•  Travail réalisé en autonomie, en centre de formation.</w:t>
             </w:r>
@@ -7748,40 +6866,8 @@
                 <w:sz w:val="20"/>
               </w:rPr>
               <w:t>•  SGBD : PostgreSQL (SQLite pour les tests).</w:t>
-            </w:r>
-            <w:r>
-              <w:rPr>
-                <w:rFonts w:cstheme="minorHAnsi"/>
-                <w:color w:val="1B2A3A"/>
-                <w:sz w:val="20"/>
-              </w:rPr>
               <w:br/>
-              <w:t xml:space="preserve">• Accès aux données : ORM </w:t>
-            </w:r>
-            <w:proofErr w:type="spellStart"/>
-            <w:r>
-              <w:rPr>
-                <w:rFonts w:cstheme="minorHAnsi"/>
-                <w:color w:val="1B2A3A"/>
-                <w:sz w:val="20"/>
-              </w:rPr>
-              <w:t>SQLAlchemy</w:t>
-            </w:r>
-            <w:proofErr w:type="spellEnd"/>
-            <w:r>
-              <w:rPr>
-                <w:rFonts w:cstheme="minorHAnsi"/>
-                <w:color w:val="1B2A3A"/>
-                <w:sz w:val="20"/>
-              </w:rPr>
-              <w:t>. Langage SQL pour le modèle physique.</w:t>
-            </w:r>
-            <w:r>
-              <w:rPr>
-                <w:rFonts w:cstheme="minorHAnsi"/>
-                <w:color w:val="1B2A3A"/>
-                <w:sz w:val="20"/>
-              </w:rPr>
+              <w:t xml:space="preserve">• Accès aux données : ORM SQLAlchemy. Langage SQL pour le modèle physique.</w:t>
               <w:br/>
               <w:t>• Modélisation : Merise (MCD / MLD / MPD), outils de diagramme.</w:t>
             </w:r>
@@ -8183,15 +7269,7 @@
                     <w:color w:val="1B2A3A"/>
                     <w:sz w:val="20"/>
                   </w:rPr>
-                  <w:t>ESTIAM</w:t>
-                </w:r>
-                <w:r>
-                  <w:rPr>
-                    <w:rFonts w:cstheme="minorHAnsi"/>
-                    <w:color w:val="1B2A3A"/>
-                    <w:sz w:val="20"/>
-                  </w:rPr>
-                  <w:t xml:space="preserve"> Paris</w:t>
+                  <w:t xml:space="preserve">ESTIAM Paris</w:t>
                 </w:r>
               </w:p>
             </w:tc>
@@ -8284,15 +7362,7 @@
                     <w:color w:val="1B2A3A"/>
                     <w:sz w:val="20"/>
                   </w:rPr>
-                  <w:t>Projet</w:t>
-                </w:r>
-                <w:r>
-                  <w:rPr>
-                    <w:rFonts w:cstheme="minorHAnsi"/>
-                    <w:color w:val="1B2A3A"/>
-                    <w:sz w:val="20"/>
-                  </w:rPr>
-                  <w:t xml:space="preserve"> de fin d'études CDA</w:t>
+                  <w:t xml:space="preserve">Projet de fin d'études CDA</w:t>
                 </w:r>
               </w:sdtContent>
             </w:sdt>
@@ -8327,14 +7397,7 @@
                 <w:rFonts w:cstheme="minorHAnsi"/>
                 <w:color w:val="404040" w:themeColor="text1" w:themeTint="BF"/>
               </w:rPr>
-              <w:t xml:space="preserve">Période </w:t>
-            </w:r>
-            <w:r>
-              <w:rPr>
-                <w:rFonts w:cstheme="minorHAnsi"/>
-                <w:color w:val="404040" w:themeColor="text1" w:themeTint="BF"/>
-              </w:rPr>
-              <w:t>d’exercice</w:t>
+              <w:t xml:space="preserve">Période d’exercice</w:t>
             </w:r>
             <w:r>
               <w:rPr>
@@ -8343,13 +7406,6 @@
                 <w:color w:val="404040" w:themeColor="text1" w:themeTint="BF"/>
               </w:rPr>
               <w:t xml:space="preserve"> </w:t>
-            </w:r>
-            <w:r>
-              <w:rPr>
-                <w:rFonts w:cstheme="minorHAnsi"/>
-                <w:b/>
-                <w:color w:val="404040" w:themeColor="text1" w:themeTint="BF"/>
-              </w:rPr>
               <w:tab/>
             </w:r>
             <w:r>
@@ -8361,51 +7417,7 @@
                 <w:szCs w:val="12"/>
                 <w:lang w:eastAsia="fr-FR"/>
               </w:rPr>
-              <w:t></w:t>
-            </w:r>
-            <w:r>
-              <w:rPr>
-                <w:rFonts w:ascii="Wingdings 3" w:hAnsi="Wingdings 3" w:cstheme="minorHAnsi"/>
-                <w:noProof/>
-                <w:color w:val="D60093"/>
-                <w:sz w:val="12"/>
-                <w:szCs w:val="12"/>
-                <w:lang w:eastAsia="fr-FR"/>
-              </w:rPr>
-              <w:t></w:t>
-            </w:r>
-            <w:r>
-              <w:rPr>
-                <w:rFonts w:ascii="Wingdings 3" w:hAnsi="Wingdings 3" w:cstheme="minorHAnsi"/>
-                <w:noProof/>
-                <w:color w:val="D60093"/>
-                <w:sz w:val="12"/>
-                <w:szCs w:val="12"/>
-                <w:lang w:eastAsia="fr-FR"/>
-              </w:rPr>
-              <w:t></w:t>
-            </w:r>
-            <w:r>
-              <w:rPr>
-                <w:rFonts w:ascii="Wingdings 3" w:hAnsi="Wingdings 3" w:cstheme="minorHAnsi"/>
-                <w:noProof/>
-                <w:color w:val="D60093"/>
-                <w:sz w:val="12"/>
-                <w:szCs w:val="12"/>
-                <w:lang w:eastAsia="fr-FR"/>
-              </w:rPr>
-              <w:t></w:t>
-            </w:r>
-            <w:r>
-              <w:rPr>
-                <w:rFonts w:ascii="Wingdings 3" w:hAnsi="Wingdings 3" w:cstheme="minorHAnsi"/>
-                <w:noProof/>
-                <w:color w:val="D60093"/>
-                <w:sz w:val="12"/>
-                <w:szCs w:val="12"/>
-                <w:lang w:eastAsia="fr-FR"/>
-              </w:rPr>
-              <w:t></w:t>
+              <w:t></w:t>
             </w:r>
             <w:r>
               <w:rPr>
@@ -8413,12 +7425,6 @@
                 <w:color w:val="404040" w:themeColor="text1" w:themeTint="BF"/>
               </w:rPr>
               <w:t>Du :</w:t>
-            </w:r>
-            <w:r>
-              <w:rPr>
-                <w:rFonts w:cstheme="minorHAnsi"/>
-                <w:color w:val="404040" w:themeColor="text1" w:themeTint="BF"/>
-              </w:rPr>
               <w:tab/>
             </w:r>
             <w:sdt>
@@ -8952,18 +7958,8 @@
                     <w:i/>
                     <w:color w:val="000000" w:themeColor="text1"/>
                   </w:rPr>
-                  <w:t xml:space="preserve">Conception, développement et déploiement de l'application </w:t>
+                  <w:t xml:space="preserve">Conception, développement et déploiement de l'application CongésFlow</w:t>
                 </w:r>
-                <w:proofErr w:type="spellStart"/>
-                <w:r>
-                  <w:rPr>
-                    <w:rStyle w:val="Textedelespacerserv"/>
-                    <w:i/>
-                    <w:color w:val="000000" w:themeColor="text1"/>
-                  </w:rPr>
-                  <w:t>CongésFlow</w:t>
-                </w:r>
-                <w:proofErr w:type="spellEnd"/>
               </w:p>
             </w:tc>
           </w:sdtContent>
@@ -9097,178 +8093,17 @@
                 <w:color w:val="1B2A3A"/>
                 <w:sz w:val="20"/>
               </w:rPr>
-              <w:t xml:space="preserve">•  J'ai conçu et développé l'application complète </w:t>
-            </w:r>
-            <w:proofErr w:type="spellStart"/>
-            <w:r>
-              <w:rPr>
-                <w:rFonts w:cstheme="minorHAnsi"/>
-                <w:color w:val="1B2A3A"/>
-                <w:sz w:val="20"/>
-              </w:rPr>
-              <w:t>CongésFlow</w:t>
-            </w:r>
-            <w:proofErr w:type="spellEnd"/>
-            <w:r>
-              <w:rPr>
-                <w:rFonts w:cstheme="minorHAnsi"/>
-                <w:color w:val="1B2A3A"/>
-                <w:sz w:val="20"/>
-              </w:rPr>
-              <w:t xml:space="preserve"> selon une architecture en couches.</w:t>
-            </w:r>
-            <w:r>
-              <w:rPr>
-                <w:rFonts w:cstheme="minorHAnsi"/>
-                <w:color w:val="1B2A3A"/>
-                <w:sz w:val="20"/>
-              </w:rPr>
+              <w:t xml:space="preserve">•  J'ai conçu et développé l'application complète CongésFlow selon une architecture en couches.</w:t>
               <w:br/>
-              <w:t xml:space="preserve">•  Organisation agile : rédaction du </w:t>
-            </w:r>
-            <w:proofErr w:type="spellStart"/>
-            <w:r>
-              <w:rPr>
-                <w:rFonts w:cstheme="minorHAnsi"/>
-                <w:color w:val="1B2A3A"/>
-                <w:sz w:val="20"/>
-              </w:rPr>
-              <w:t>backlog</w:t>
-            </w:r>
-            <w:proofErr w:type="spellEnd"/>
-            <w:r>
-              <w:rPr>
-                <w:rFonts w:cstheme="minorHAnsi"/>
-                <w:color w:val="1B2A3A"/>
-                <w:sz w:val="20"/>
-              </w:rPr>
-              <w:t xml:space="preserve">, des User Stories et priorisation </w:t>
-            </w:r>
-            <w:proofErr w:type="spellStart"/>
-            <w:r>
-              <w:rPr>
-                <w:rFonts w:cstheme="minorHAnsi"/>
-                <w:color w:val="1B2A3A"/>
-                <w:sz w:val="20"/>
-              </w:rPr>
-              <w:t>MoSCoW</w:t>
-            </w:r>
-            <w:proofErr w:type="spellEnd"/>
-            <w:r>
-              <w:rPr>
-                <w:rFonts w:cstheme="minorHAnsi"/>
-                <w:color w:val="1B2A3A"/>
-                <w:sz w:val="20"/>
-              </w:rPr>
-              <w:t>, découpage en sprints.</w:t>
-            </w:r>
-            <w:r>
-              <w:rPr>
-                <w:rFonts w:cstheme="minorHAnsi"/>
-                <w:color w:val="1B2A3A"/>
-                <w:sz w:val="20"/>
-              </w:rPr>
+              <w:t xml:space="preserve">•  Organisation agile : rédaction du backlog, des User Stories et priorisation MoSCoW, découpage en sprints.</w:t>
               <w:br/>
               <w:t>•  Conception : diagrammes UML (contexte, cas d'utilisation, séquence, classes, état-transition, composants, déploiement).</w:t>
-            </w:r>
-            <w:r>
-              <w:rPr>
-                <w:rFonts w:cstheme="minorHAnsi"/>
-                <w:color w:val="1B2A3A"/>
-                <w:sz w:val="20"/>
-              </w:rPr>
               <w:br/>
-              <w:t xml:space="preserve">•  Développement de l'API REST avec </w:t>
-            </w:r>
-            <w:proofErr w:type="spellStart"/>
-            <w:r>
-              <w:rPr>
-                <w:rFonts w:cstheme="minorHAnsi"/>
-                <w:color w:val="1B2A3A"/>
-                <w:sz w:val="20"/>
-              </w:rPr>
-              <w:t>FastAPI</w:t>
-            </w:r>
-            <w:proofErr w:type="spellEnd"/>
-            <w:r>
-              <w:rPr>
-                <w:rFonts w:cstheme="minorHAnsi"/>
-                <w:color w:val="1B2A3A"/>
-                <w:sz w:val="20"/>
-              </w:rPr>
-              <w:t xml:space="preserve"> : authentification par jeton JWT, contrôle d'accès par rôle (RBAC), logique métier isolée et testable (jours ouvrés, soldes, machine à états des demandes).</w:t>
-            </w:r>
-            <w:r>
-              <w:rPr>
-                <w:rFonts w:cstheme="minorHAnsi"/>
-                <w:color w:val="1B2A3A"/>
-                <w:sz w:val="20"/>
-              </w:rPr>
+              <w:t xml:space="preserve">•  Développement de l'API REST avec FastAPI : authentification par jeton JWT, contrôle d'accès par rôle (RBAC), logique métier isolée et testable (jours ouvrés, soldes, machine à états des demandes).</w:t>
               <w:br/>
-              <w:t xml:space="preserve">•  Sécurité : hachage </w:t>
-            </w:r>
-            <w:proofErr w:type="spellStart"/>
-            <w:r>
-              <w:rPr>
-                <w:rFonts w:cstheme="minorHAnsi"/>
-                <w:color w:val="1B2A3A"/>
-                <w:sz w:val="20"/>
-              </w:rPr>
-              <w:t>bcrypt</w:t>
-            </w:r>
-            <w:proofErr w:type="spellEnd"/>
-            <w:r>
-              <w:rPr>
-                <w:rFonts w:cstheme="minorHAnsi"/>
-                <w:color w:val="1B2A3A"/>
-                <w:sz w:val="20"/>
-              </w:rPr>
-              <w:t xml:space="preserve"> des mots de passe, CORS restreint, validation des entrées, prise en compte de l'OWASP Top 10.</w:t>
-            </w:r>
-            <w:r>
-              <w:rPr>
-                <w:rFonts w:cstheme="minorHAnsi"/>
-                <w:color w:val="1B2A3A"/>
-                <w:sz w:val="20"/>
-              </w:rPr>
+              <w:t xml:space="preserve">•  Sécurité : hachage bcrypt des mots de passe, CORS restreint, validation des entrées, prise en compte de l'OWASP Top 10.</w:t>
               <w:br/>
-              <w:t>•  Qualité et déploiement : 21 tests automatisés (</w:t>
-            </w:r>
-            <w:proofErr w:type="spellStart"/>
-            <w:r>
-              <w:rPr>
-                <w:rFonts w:cstheme="minorHAnsi"/>
-                <w:color w:val="1B2A3A"/>
-                <w:sz w:val="20"/>
-              </w:rPr>
-              <w:t>pytest</w:t>
-            </w:r>
-            <w:proofErr w:type="spellEnd"/>
-            <w:r>
-              <w:rPr>
-                <w:rFonts w:cstheme="minorHAnsi"/>
-                <w:color w:val="1B2A3A"/>
-                <w:sz w:val="20"/>
-              </w:rPr>
-              <w:t xml:space="preserve">, </w:t>
-            </w:r>
-            <w:proofErr w:type="spellStart"/>
-            <w:r>
-              <w:rPr>
-                <w:rFonts w:cstheme="minorHAnsi"/>
-                <w:color w:val="1B2A3A"/>
-                <w:sz w:val="20"/>
-              </w:rPr>
-              <w:t>Vitest</w:t>
-            </w:r>
-            <w:proofErr w:type="spellEnd"/>
-            <w:r>
-              <w:rPr>
-                <w:rFonts w:cstheme="minorHAnsi"/>
-                <w:color w:val="1B2A3A"/>
-                <w:sz w:val="20"/>
-              </w:rPr>
-              <w:t>) tous au vert, conteneurisation Docker et intégration continue avec GitHub Actions.</w:t>
+              <w:t xml:space="preserve">•  Qualité et déploiement : 21 tests automatisés (pytest, Vitest) tous au vert, conteneurisation Docker et intégration continue avec GitHub Actions.</w:t>
             </w:r>
           </w:p>
         </w:tc>
@@ -9427,187 +8262,11 @@
                 <w:color w:val="1B2A3A"/>
                 <w:sz w:val="20"/>
               </w:rPr>
-              <w:t xml:space="preserve">•  Langage et </w:t>
-            </w:r>
-            <w:proofErr w:type="spellStart"/>
-            <w:r>
-              <w:rPr>
-                <w:rFonts w:cstheme="minorHAnsi"/>
-                <w:color w:val="1B2A3A"/>
-                <w:sz w:val="20"/>
-              </w:rPr>
-              <w:t>framework</w:t>
-            </w:r>
-            <w:proofErr w:type="spellEnd"/>
-            <w:r>
-              <w:rPr>
-                <w:rFonts w:cstheme="minorHAnsi"/>
-                <w:color w:val="1B2A3A"/>
-                <w:sz w:val="20"/>
-              </w:rPr>
-              <w:t xml:space="preserve"> : Python, </w:t>
-            </w:r>
-            <w:proofErr w:type="spellStart"/>
-            <w:r>
-              <w:rPr>
-                <w:rFonts w:cstheme="minorHAnsi"/>
-                <w:color w:val="1B2A3A"/>
-                <w:sz w:val="20"/>
-              </w:rPr>
-              <w:t>FastAPI</w:t>
-            </w:r>
-            <w:proofErr w:type="spellEnd"/>
-            <w:r>
-              <w:rPr>
-                <w:rFonts w:cstheme="minorHAnsi"/>
-                <w:color w:val="1B2A3A"/>
-                <w:sz w:val="20"/>
-              </w:rPr>
-              <w:t xml:space="preserve">, </w:t>
-            </w:r>
-            <w:proofErr w:type="spellStart"/>
-            <w:r>
-              <w:rPr>
-                <w:rFonts w:cstheme="minorHAnsi"/>
-                <w:color w:val="1B2A3A"/>
-                <w:sz w:val="20"/>
-              </w:rPr>
-              <w:t>SQLAlchemy</w:t>
-            </w:r>
-            <w:proofErr w:type="spellEnd"/>
-            <w:r>
-              <w:rPr>
-                <w:rFonts w:cstheme="minorHAnsi"/>
-                <w:color w:val="1B2A3A"/>
-                <w:sz w:val="20"/>
-              </w:rPr>
-              <w:t>.</w:t>
-            </w:r>
-            <w:r>
-              <w:rPr>
-                <w:rFonts w:cstheme="minorHAnsi"/>
-                <w:color w:val="1B2A3A"/>
-                <w:sz w:val="20"/>
-              </w:rPr>
+              <w:t xml:space="preserve">•  Langage et framework : Python, FastAPI, SQLAlchemy.</w:t>
               <w:br/>
-              <w:t>• Sécurité : python-</w:t>
-            </w:r>
-            <w:proofErr w:type="spellStart"/>
-            <w:r>
-              <w:rPr>
-                <w:rFonts w:cstheme="minorHAnsi"/>
-                <w:color w:val="1B2A3A"/>
-                <w:sz w:val="20"/>
-              </w:rPr>
-              <w:t>jose</w:t>
-            </w:r>
-            <w:proofErr w:type="spellEnd"/>
-            <w:r>
-              <w:rPr>
-                <w:rFonts w:cstheme="minorHAnsi"/>
-                <w:color w:val="1B2A3A"/>
-                <w:sz w:val="20"/>
-              </w:rPr>
-              <w:t xml:space="preserve"> (JWT), </w:t>
-            </w:r>
-            <w:proofErr w:type="spellStart"/>
-            <w:r>
-              <w:rPr>
-                <w:rFonts w:cstheme="minorHAnsi"/>
-                <w:color w:val="1B2A3A"/>
-                <w:sz w:val="20"/>
-              </w:rPr>
-              <w:t>passlib</w:t>
-            </w:r>
-            <w:proofErr w:type="spellEnd"/>
-            <w:r>
-              <w:rPr>
-                <w:rFonts w:cstheme="minorHAnsi"/>
-                <w:color w:val="1B2A3A"/>
-                <w:sz w:val="20"/>
-              </w:rPr>
-              <w:t>/</w:t>
-            </w:r>
-            <w:proofErr w:type="spellStart"/>
-            <w:r>
-              <w:rPr>
-                <w:rFonts w:cstheme="minorHAnsi"/>
-                <w:color w:val="1B2A3A"/>
-                <w:sz w:val="20"/>
-              </w:rPr>
-              <w:t>bcrypt</w:t>
-            </w:r>
-            <w:proofErr w:type="spellEnd"/>
-            <w:r>
-              <w:rPr>
-                <w:rFonts w:cstheme="minorHAnsi"/>
-                <w:color w:val="1B2A3A"/>
-                <w:sz w:val="20"/>
-              </w:rPr>
-              <w:t>.</w:t>
-            </w:r>
-            <w:r>
-              <w:rPr>
-                <w:rFonts w:cstheme="minorHAnsi"/>
-                <w:color w:val="1B2A3A"/>
-                <w:sz w:val="20"/>
-              </w:rPr>
+              <w:t xml:space="preserve">• Sécurité : python-jose (JWT), passlib/bcrypt.</w:t>
               <w:br/>
-              <w:t xml:space="preserve">• Tests : </w:t>
-            </w:r>
-            <w:proofErr w:type="spellStart"/>
-            <w:r>
-              <w:rPr>
-                <w:rFonts w:cstheme="minorHAnsi"/>
-                <w:color w:val="1B2A3A"/>
-                <w:sz w:val="20"/>
-              </w:rPr>
-              <w:t>pytest</w:t>
-            </w:r>
-            <w:proofErr w:type="spellEnd"/>
-            <w:r>
-              <w:rPr>
-                <w:rFonts w:cstheme="minorHAnsi"/>
-                <w:color w:val="1B2A3A"/>
-                <w:sz w:val="20"/>
-              </w:rPr>
-              <w:t xml:space="preserve">, </w:t>
-            </w:r>
-            <w:proofErr w:type="spellStart"/>
-            <w:r>
-              <w:rPr>
-                <w:rFonts w:cstheme="minorHAnsi"/>
-                <w:color w:val="1B2A3A"/>
-                <w:sz w:val="20"/>
-              </w:rPr>
-              <w:t>httpx</w:t>
-            </w:r>
-            <w:proofErr w:type="spellEnd"/>
-            <w:r>
-              <w:rPr>
-                <w:rFonts w:cstheme="minorHAnsi"/>
-                <w:color w:val="1B2A3A"/>
-                <w:sz w:val="20"/>
-              </w:rPr>
-              <w:t xml:space="preserve">, </w:t>
-            </w:r>
-            <w:proofErr w:type="spellStart"/>
-            <w:r>
-              <w:rPr>
-                <w:rFonts w:cstheme="minorHAnsi"/>
-                <w:color w:val="1B2A3A"/>
-                <w:sz w:val="20"/>
-              </w:rPr>
-              <w:t>Vitest</w:t>
-            </w:r>
-            <w:proofErr w:type="spellEnd"/>
-            <w:r>
-              <w:rPr>
-                <w:rFonts w:cstheme="minorHAnsi"/>
-                <w:color w:val="1B2A3A"/>
-                <w:sz w:val="20"/>
-              </w:rPr>
-              <w:t>. DevOps : Docker, docker-compose, GitHub Actions, Git/GitHub.</w:t>
+              <w:t xml:space="preserve">• Tests : pytest, httpx, Vitest. DevOps : Docker, docker-compose, GitHub Actions, Git/GitHub.</w:t>
             </w:r>
           </w:p>
         </w:tc>
@@ -10001,7 +8660,6 @@
                     <w:sz w:val="24"/>
                   </w:rPr>
                 </w:pPr>
-                <w:proofErr w:type="spellStart"/>
                 <w:r>
                   <w:rPr>
                     <w:rFonts w:cstheme="minorHAnsi"/>
@@ -10010,7 +8668,6 @@
                   </w:rPr>
                   <w:t>Estiam</w:t>
                 </w:r>
-                <w:proofErr w:type="spellEnd"/>
               </w:p>
             </w:tc>
           </w:sdtContent>
@@ -10102,15 +8759,7 @@
                     <w:color w:val="1B2A3A"/>
                     <w:sz w:val="20"/>
                   </w:rPr>
-                  <w:t>Projet</w:t>
-                </w:r>
-                <w:r>
-                  <w:rPr>
-                    <w:rFonts w:cstheme="minorHAnsi"/>
-                    <w:color w:val="1B2A3A"/>
-                    <w:sz w:val="20"/>
-                  </w:rPr>
-                  <w:t xml:space="preserve"> de fin d'études CDA </w:t>
+                  <w:t xml:space="preserve">Projet de fin d'études CDA </w:t>
                 </w:r>
               </w:sdtContent>
             </w:sdt>
@@ -10145,14 +8794,7 @@
                 <w:rFonts w:cstheme="minorHAnsi"/>
                 <w:color w:val="404040" w:themeColor="text1" w:themeTint="BF"/>
               </w:rPr>
-              <w:t xml:space="preserve">Période </w:t>
-            </w:r>
-            <w:r>
-              <w:rPr>
-                <w:rFonts w:cstheme="minorHAnsi"/>
-                <w:color w:val="404040" w:themeColor="text1" w:themeTint="BF"/>
-              </w:rPr>
-              <w:t>d’exercice</w:t>
+              <w:t xml:space="preserve">Période d’exercice</w:t>
             </w:r>
             <w:r>
               <w:rPr>
@@ -10161,13 +8803,6 @@
                 <w:color w:val="404040" w:themeColor="text1" w:themeTint="BF"/>
               </w:rPr>
               <w:t xml:space="preserve"> </w:t>
-            </w:r>
-            <w:r>
-              <w:rPr>
-                <w:rFonts w:cstheme="minorHAnsi"/>
-                <w:b/>
-                <w:color w:val="404040" w:themeColor="text1" w:themeTint="BF"/>
-              </w:rPr>
               <w:tab/>
             </w:r>
             <w:r>
@@ -10179,51 +8814,7 @@
                 <w:szCs w:val="12"/>
                 <w:lang w:eastAsia="fr-FR"/>
               </w:rPr>
-              <w:t></w:t>
-            </w:r>
-            <w:r>
-              <w:rPr>
-                <w:rFonts w:ascii="Wingdings 3" w:hAnsi="Wingdings 3" w:cstheme="minorHAnsi"/>
-                <w:noProof/>
-                <w:color w:val="D60093"/>
-                <w:sz w:val="12"/>
-                <w:szCs w:val="12"/>
-                <w:lang w:eastAsia="fr-FR"/>
-              </w:rPr>
-              <w:t></w:t>
-            </w:r>
-            <w:r>
-              <w:rPr>
-                <w:rFonts w:ascii="Wingdings 3" w:hAnsi="Wingdings 3" w:cstheme="minorHAnsi"/>
-                <w:noProof/>
-                <w:color w:val="D60093"/>
-                <w:sz w:val="12"/>
-                <w:szCs w:val="12"/>
-                <w:lang w:eastAsia="fr-FR"/>
-              </w:rPr>
-              <w:t></w:t>
-            </w:r>
-            <w:r>
-              <w:rPr>
-                <w:rFonts w:ascii="Wingdings 3" w:hAnsi="Wingdings 3" w:cstheme="minorHAnsi"/>
-                <w:noProof/>
-                <w:color w:val="D60093"/>
-                <w:sz w:val="12"/>
-                <w:szCs w:val="12"/>
-                <w:lang w:eastAsia="fr-FR"/>
-              </w:rPr>
-              <w:t></w:t>
-            </w:r>
-            <w:r>
-              <w:rPr>
-                <w:rFonts w:ascii="Wingdings 3" w:hAnsi="Wingdings 3" w:cstheme="minorHAnsi"/>
-                <w:noProof/>
-                <w:color w:val="D60093"/>
-                <w:sz w:val="12"/>
-                <w:szCs w:val="12"/>
-                <w:lang w:eastAsia="fr-FR"/>
-              </w:rPr>
-              <w:t></w:t>
+              <w:t></w:t>
             </w:r>
             <w:r>
               <w:rPr>
@@ -10231,12 +8822,6 @@
                 <w:color w:val="404040" w:themeColor="text1" w:themeTint="BF"/>
               </w:rPr>
               <w:t>Du :</w:t>
-            </w:r>
-            <w:r>
-              <w:rPr>
-                <w:rFonts w:cstheme="minorHAnsi"/>
-                <w:color w:val="404040" w:themeColor="text1" w:themeTint="BF"/>
-              </w:rPr>
               <w:tab/>
             </w:r>
             <w:sdt>
@@ -10445,41 +9030,7 @@
                 <w:color w:val="1B2A3A"/>
                 <w:sz w:val="20"/>
               </w:rPr>
-              <w:t>Architecture en couches ; documentation d'API (</w:t>
-            </w:r>
-            <w:proofErr w:type="spellStart"/>
-            <w:r>
-              <w:rPr>
-                <w:rFonts w:cstheme="minorHAnsi"/>
-                <w:color w:val="1B2A3A"/>
-                <w:sz w:val="20"/>
-              </w:rPr>
-              <w:t>OpenAPI</w:t>
-            </w:r>
-            <w:proofErr w:type="spellEnd"/>
-            <w:r>
-              <w:rPr>
-                <w:rFonts w:cstheme="minorHAnsi"/>
-                <w:color w:val="1B2A3A"/>
-                <w:sz w:val="20"/>
-              </w:rPr>
-              <w:t>) générée automatiquement ; 2</w:t>
-            </w:r>
-            <w:r>
-              <w:rPr>
-                <w:rFonts w:cstheme="minorHAnsi"/>
-                <w:color w:val="1B2A3A"/>
-                <w:sz w:val="20"/>
-              </w:rPr>
-              <w:t>6</w:t>
-            </w:r>
-            <w:r>
-              <w:rPr>
-                <w:rFonts w:cstheme="minorHAnsi"/>
-                <w:color w:val="1B2A3A"/>
-                <w:sz w:val="20"/>
-              </w:rPr>
-              <w:t xml:space="preserve"> tests au vert.</w:t>
+              <w:t xml:space="preserve">Architecture en couches ; documentation d'API (OpenAPI) générée automatiquement ; 26 tests au vert.</w:t>
             </w:r>
           </w:p>
         </w:tc>
@@ -10669,29 +9220,7 @@
                 <w:sz w:val="28"/>
                 <w:szCs w:val="28"/>
               </w:rPr>
-              <w:t>(</w:t>
-            </w:r>
-            <w:proofErr w:type="gramStart"/>
-            <w:r>
-              <w:rPr>
-                <w:rFonts w:cstheme="minorHAnsi"/>
-                <w:i/>
-                <w:color w:val="404040" w:themeColor="text1" w:themeTint="BF"/>
-                <w:sz w:val="28"/>
-                <w:szCs w:val="28"/>
-              </w:rPr>
-              <w:t>facultatif</w:t>
-            </w:r>
-            <w:proofErr w:type="gramEnd"/>
-            <w:r>
-              <w:rPr>
-                <w:rFonts w:cstheme="minorHAnsi"/>
-                <w:i/>
-                <w:color w:val="404040" w:themeColor="text1" w:themeTint="BF"/>
-                <w:sz w:val="28"/>
-                <w:szCs w:val="28"/>
-              </w:rPr>
-              <w:t>)</w:t>
+              <w:t>(facultatif)</w:t>
             </w:r>
           </w:p>
           <w:p>
@@ -10843,7 +9372,6 @@
             <w:alias w:val="Titre, diplôme"/>
             <w:tag w:val="diplome"/>
             <w:id w:val="-1815783948"/>
-            <w:showingPlcHdr/>
           </w:sdtPr>
           <w:sdtContent>
             <w:tc>
@@ -10872,11 +9400,8 @@
                   </w:rPr>
                 </w:pPr>
                 <w:r>
-                  <w:rPr>
-                    <w:rStyle w:val="Textedelespacerserv"/>
-                    <w:shd w:val="clear" w:color="auto" w:fill="BFBFBF" w:themeFill="background1" w:themeFillShade="BF"/>
-                  </w:rPr>
-                  <w:t>Cliquez ici.</w:t>
+                  <w:rPr/>
+                  <w:t xml:space="preserve">BTS SIO — option SLAM</w:t>
                 </w:r>
               </w:p>
             </w:tc>
@@ -10950,6 +9475,171 @@
             <w:alias w:val="date"/>
             <w:tag w:val="date"/>
             <w:id w:val="-731318474"/>
+            <w:showingPlcHdr/>
+            <w:date w:fullDate="2017-02-15T00:00:00Z">
+              <w:dateFormat w:val="dd/MM/yyyy"/>
+              <w:lid w:val="fr-FR"/>
+              <w:storeMappedDataAs w:val="dateTime"/>
+              <w:calendar w:val="gregorian"/>
+            </w:date>
+          </w:sdtPr>
+          <w:sdtContent>
+            <w:tc>
+              <w:tcPr>
+                <w:tcW w:w="2550" w:type="dxa"/>
+                <w:tcBorders>
+                  <w:top w:val="single" w:sz="4" w:space="0" w:color="BFBFBF" w:themeColor="background1" w:themeShade="BF"/>
+                  <w:left w:val="single" w:sz="4" w:space="0" w:color="D9D9D9" w:themeColor="background1" w:themeShade="D9"/>
+                  <w:bottom w:val="single" w:sz="4" w:space="0" w:color="D9D9D9" w:themeColor="background1" w:themeShade="D9"/>
+                  <w:right w:val="single" w:sz="4" w:space="0" w:color="BFBFBF" w:themeColor="background1" w:themeShade="BF"/>
+                </w:tcBorders>
+                <w:vAlign w:val="center"/>
+              </w:tcPr>
+              <w:p>
+                <w:pPr>
+                  <w:tabs>
+                    <w:tab w:val="left" w:pos="850"/>
+                  </w:tabs>
+                  <w:ind w:right="175"/>
+                  <w:jc w:val="center"/>
+                  <w:rPr>
+                    <w:rFonts w:cstheme="minorHAnsi"/>
+                    <w:color w:val="404040" w:themeColor="text1" w:themeTint="BF"/>
+                    <w:sz w:val="20"/>
+                    <w:szCs w:val="20"/>
+                  </w:rPr>
+                </w:pPr>
+                <w:r>
+                  <w:rPr>
+                    <w:rStyle w:val="Textedelespacerserv"/>
+                    <w:shd w:val="clear" w:color="auto" w:fill="BFBFBF" w:themeFill="background1" w:themeFillShade="BF"/>
+                  </w:rPr>
+                  <w:t>Cliquez ici pour sélectionner une date.</w:t>
+                </w:r>
+              </w:p>
+            </w:tc>
+          </w:sdtContent>
+        </w:sdt>
+      </w:tr>
+      <w:tr>
+        <w:trPr>
+          <w:trHeight w:val="510"/>
+        </w:trPr>
+        <w:sdt>
+          <w:sdtPr>
+            <w:rPr>
+              <w:rFonts w:cstheme="minorHAnsi"/>
+              <w:b/>
+              <w:color w:val="404040" w:themeColor="text1" w:themeTint="BF"/>
+              <w:sz w:val="20"/>
+              <w:szCs w:val="20"/>
+            </w:rPr>
+            <w:alias w:val="Titre, diplôme"/>
+            <w:tag w:val="diplome"/>
+            <w:id w:val="680647715"/>
+          </w:sdtPr>
+          <w:sdtContent>
+            <w:tc>
+              <w:tcPr>
+                <w:tcW w:w="2553" w:type="dxa"/>
+                <w:tcBorders>
+                  <w:top w:val="single" w:sz="4" w:space="0" w:color="BFBFBF" w:themeColor="background1" w:themeShade="BF"/>
+                  <w:left w:val="single" w:sz="4" w:space="0" w:color="BFBFBF" w:themeColor="background1" w:themeShade="BF"/>
+                  <w:bottom w:val="single" w:sz="4" w:space="0" w:color="D9D9D9" w:themeColor="background1" w:themeShade="D9"/>
+                  <w:right w:val="single" w:sz="4" w:space="0" w:color="D9D9D9" w:themeColor="background1" w:themeShade="D9"/>
+                </w:tcBorders>
+                <w:vAlign w:val="center"/>
+              </w:tcPr>
+              <w:p>
+                <w:pPr>
+                  <w:tabs>
+                    <w:tab w:val="left" w:pos="850"/>
+                  </w:tabs>
+                  <w:ind w:right="175"/>
+                  <w:rPr>
+                    <w:rFonts w:cstheme="minorHAnsi"/>
+                    <w:b/>
+                    <w:color w:val="404040" w:themeColor="text1" w:themeTint="BF"/>
+                    <w:sz w:val="20"/>
+                    <w:szCs w:val="20"/>
+                  </w:rPr>
+                </w:pPr>
+                <w:r>
+                  <w:rPr/>
+                  <w:t xml:space="preserve">Baccalauréat série C (mathématiques et physique)</w:t>
+                </w:r>
+              </w:p>
+            </w:tc>
+          </w:sdtContent>
+        </w:sdt>
+        <w:sdt>
+          <w:sdtPr>
+            <w:rPr>
+              <w:rFonts w:cstheme="minorHAnsi"/>
+              <w:b/>
+              <w:color w:val="404040" w:themeColor="text1" w:themeTint="BF"/>
+              <w:sz w:val="20"/>
+              <w:szCs w:val="20"/>
+              <w:shd w:val="clear" w:color="auto" w:fill="BFBFBF" w:themeFill="background1" w:themeFillShade="BF"/>
+            </w:rPr>
+            <w:alias w:val="Organisme"/>
+            <w:tag w:val="Organisme"/>
+            <w:id w:val="749591327"/>
+            <w:showingPlcHdr/>
+          </w:sdtPr>
+          <w:sdtEndPr>
+            <w:rPr>
+              <w:shd w:val="clear" w:color="auto" w:fill="auto"/>
+            </w:rPr>
+          </w:sdtEndPr>
+          <w:sdtContent>
+            <w:tc>
+              <w:tcPr>
+                <w:tcW w:w="4536" w:type="dxa"/>
+                <w:tcBorders>
+                  <w:top w:val="single" w:sz="4" w:space="0" w:color="BFBFBF" w:themeColor="background1" w:themeShade="BF"/>
+                  <w:left w:val="single" w:sz="4" w:space="0" w:color="D9D9D9" w:themeColor="background1" w:themeShade="D9"/>
+                  <w:bottom w:val="single" w:sz="4" w:space="0" w:color="D9D9D9" w:themeColor="background1" w:themeShade="D9"/>
+                  <w:right w:val="single" w:sz="4" w:space="0" w:color="D9D9D9" w:themeColor="background1" w:themeShade="D9"/>
+                </w:tcBorders>
+                <w:vAlign w:val="center"/>
+              </w:tcPr>
+              <w:p>
+                <w:pPr>
+                  <w:tabs>
+                    <w:tab w:val="left" w:pos="850"/>
+                  </w:tabs>
+                  <w:ind w:right="175"/>
+                  <w:rPr>
+                    <w:rFonts w:cstheme="minorHAnsi"/>
+                    <w:b/>
+                    <w:color w:val="404040" w:themeColor="text1" w:themeTint="BF"/>
+                    <w:sz w:val="20"/>
+                    <w:szCs w:val="20"/>
+                  </w:rPr>
+                </w:pPr>
+                <w:r>
+                  <w:rPr>
+                    <w:rStyle w:val="Textedelespacerserv"/>
+                    <w:shd w:val="clear" w:color="auto" w:fill="BFBFBF" w:themeFill="background1" w:themeFillShade="BF"/>
+                  </w:rPr>
+                  <w:t>Cliquez ici pour taper du texte.</w:t>
+                </w:r>
+              </w:p>
+            </w:tc>
+          </w:sdtContent>
+        </w:sdt>
+        <w:sdt>
+          <w:sdtPr>
+            <w:rPr>
+              <w:rFonts w:cstheme="minorHAnsi"/>
+              <w:color w:val="404040" w:themeColor="text1" w:themeTint="BF"/>
+              <w:sz w:val="20"/>
+              <w:szCs w:val="20"/>
+            </w:rPr>
+            <w:alias w:val="date"/>
+            <w:tag w:val="date"/>
+            <w:id w:val="819323491"/>
             <w:showingPlcHdr/>
             <w:date w:fullDate="2017-02-15T00:00:00Z">
               <w:dateFormat w:val="dd/MM/yyyy"/>
@@ -11948,7 +10638,7 @@
                                     <w:sz w:val="24"/>
                                     <w:szCs w:val="24"/>
                                   </w:rPr>
-                                  <w:t>BOUNGOU MBIMI Gloire Bryan</w:t>
+                                  <w:t xml:space="preserve">BOUNGOU MBIMI Gloire Bryan</w:t>
                                 </w:r>
                               </w:p>
                             </w:sdtContent>
@@ -12076,16 +10766,7 @@
           <w:sz w:val="24"/>
           <w:szCs w:val="24"/>
         </w:rPr>
-        <w:t>Déclare</w:t>
-      </w:r>
-      <w:r>
-        <w:rPr>
-          <w:rFonts w:cstheme="minorHAnsi"/>
-          <w:color w:val="404040" w:themeColor="text1" w:themeTint="BF"/>
-          <w:sz w:val="24"/>
-          <w:szCs w:val="24"/>
-        </w:rPr>
-        <w:t xml:space="preserve"> sur l’honneur que les renseignements fournis dans ce dossier sont exacts et que je suis l’auteur(e) des réalisations jointes.</w:t>
+        <w:t xml:space="preserve">Déclare sur l’honneur que les renseignements fournis dans ce dossier sont exacts et que je suis l’auteur(e) des réalisations jointes.</w:t>
       </w:r>
     </w:p>
     <w:p>
@@ -12458,14 +11139,6 @@
           <w:szCs w:val="24"/>
         </w:rPr>
         <w:t xml:space="preserve"> </w:t>
-      </w:r>
-      <w:r>
-        <w:rPr>
-          <w:rFonts w:cstheme="minorHAnsi"/>
-          <w:color w:val="BFBFBF" w:themeColor="background1" w:themeShade="BF"/>
-          <w:sz w:val="24"/>
-          <w:szCs w:val="24"/>
-        </w:rPr>
         <w:tab/>
       </w:r>
     </w:p>
@@ -12490,16 +11163,7 @@
           <w:sz w:val="24"/>
           <w:szCs w:val="24"/>
         </w:rPr>
-        <w:t>Pour</w:t>
-      </w:r>
-      <w:r>
-        <w:rPr>
-          <w:rFonts w:cstheme="minorHAnsi"/>
-          <w:color w:val="404040" w:themeColor="text1" w:themeTint="BF"/>
-          <w:sz w:val="24"/>
-          <w:szCs w:val="24"/>
-        </w:rPr>
-        <w:t xml:space="preserve"> faire valoir ce que de droit.</w:t>
+        <w:t xml:space="preserve">Pour faire valoir ce que de droit.</w:t>
       </w:r>
     </w:p>
     <w:p>
@@ -12731,29 +11395,7 @@
                 <w:sz w:val="28"/>
                 <w:szCs w:val="28"/>
               </w:rPr>
-              <w:t>(</w:t>
-            </w:r>
-            <w:proofErr w:type="gramStart"/>
-            <w:r>
-              <w:rPr>
-                <w:rFonts w:cstheme="minorHAnsi"/>
-                <w:i/>
-                <w:color w:val="404040" w:themeColor="text1" w:themeTint="BF"/>
-                <w:sz w:val="28"/>
-                <w:szCs w:val="28"/>
-              </w:rPr>
-              <w:t>facultatif</w:t>
-            </w:r>
-            <w:proofErr w:type="gramEnd"/>
-            <w:r>
-              <w:rPr>
-                <w:rFonts w:cstheme="minorHAnsi"/>
-                <w:i/>
-                <w:color w:val="404040" w:themeColor="text1" w:themeTint="BF"/>
-                <w:sz w:val="28"/>
-                <w:szCs w:val="28"/>
-              </w:rPr>
-              <w:t>)</w:t>
+              <w:t>(facultatif)</w:t>
             </w:r>
           </w:p>
           <w:p>

</xml_diff>